<commit_message>
Refactor introduction content in Capitulo_1_Introducao.docx and exportar_introducao.py for consistency and clarity. Updated references to "premium" and "high standard" products, improved semantic structure, and ensured uniform citation formatting throughout the document.
</commit_message>
<xml_diff>
--- a/outputs/Capitulo_1_Introducao.docx
+++ b/outputs/Capitulo_1_Introducao.docx
@@ -42,7 +42,7 @@
           <w:b w:val="0"/>
           <w:sz w:val="24"/>
         </w:rPr>
-        <w:t>Sistemas de recomendação ocupam posição estratégica em plataformas de comércio eletrônico porque reduzem o custo cognitivo da escolha. O usuário raramente percorre todo o catálogo disponível; ele navega por uma fração limitada de produtos, compara poucos atributos e decide a partir de sinais incompletos. Para a loja, a recomendação atua como mecanismo de organização do catálogo, exposição de itens relevantes e aumento de aderência entre intenção de compra e oferta. O problema deixa de ser apenas apresentar produtos populares. A tarefa técnica passa a ser interpretar preferências, inferir contexto e ordenar alternativas sob incerteza, aspecto recorrente na literatura de sistemas de recomendação (ADOMAVICIUS; TUZHILIN, 2005; ISINKAYE; FOLAJIMI; OJOKOH, 2015).</w:t>
+        <w:t>Sistemas de recomendação ocupam posição estratégica em plataformas de comércio eletrônico porque reduzem o custo cognitivo da escolha. O usuário raramente percorre todo o catálogo disponível; ele navega por uma fração limitada de produtos, compara poucos atributos e decide a partir de sinais incompletos. Para a loja, a recomendação atua como mecanismo de organização do catálogo, exposição de itens relevantes e aumento de aderência entre intenção de compra e oferta. O problema deixa de ser apenas apresentar produtos populares. A tarefa técnica passa a ser interpretar preferências, inferir contexto e ordenar alternativas sob incerteza, aspecto recorrente na literatura de sistemas de recomendação (Adomavicius; Tuzhilin, 2005; Isinkaye; Folajimi; Ojokoh, 2015).</w:t>
       </w:r>
     </w:p>
     <w:p>
@@ -57,7 +57,7 @@
           <w:b w:val="0"/>
           <w:sz w:val="24"/>
         </w:rPr>
-        <w:t>Modelos tradicionais de recomendação, especialmente os baseados em filtragem colaborativa, dependem de padrões recorrentes de interação entre usuários e itens. Essa dependência produz bons resultados quando há grande volume de avaliações, compras, cliques ou visualizações. O desempenho se fragiliza quando a matriz usuário-item é esparsa. Esse ponto é crítico em mercados de nicho, como e-commerces de produtos residenciais de alto padrão. Um catálogo premium, semelhante ao domínio de atuação da Kouzina Club, tende a envolver itens de maior valor financeiro, ciclos de compra mais longos e menor repetição transacional. O usuário não compra uma adega climatizada, uma cafeteira premium ou um conjunto de metais de banheiro com a mesma frequência com que compra itens de consumo recorrente.</w:t>
+        <w:t>Modelos tradicionais de recomendação, especialmente os baseados em filtragem colaborativa, dependem de padrões recorrentes de interação entre usuários e itens. Essa dependência produz bons resultados quando há grande volume de avaliações, compras, cliques ou visualizações. O desempenho se fragiliza quando a matriz usuário-item é esparsa. Esse ponto é crítico em mercados de nicho, como comércios eletrônicos de produtos residenciais de alto padrão. Um catálogo de alto padrão, semelhante ao domínio de atuação da Kouzina Club, tende a envolver itens de maior valor financeiro, ciclos de compra mais longos e menor repetição transacional. O usuário não compra uma adega climatizada, uma cafeteira de alto padrão ou um conjunto de metais de banheiro com a mesma frequência com que compra itens de consumo recorrente.</w:t>
       </w:r>
     </w:p>
     <w:p>
@@ -87,7 +87,7 @@
           <w:b w:val="0"/>
           <w:sz w:val="24"/>
         </w:rPr>
-        <w:t>Outro problema aparece na natureza da preferência. A intenção de compra em produtos premium não é binária. Um usuário pode ter alta afinidade por cozinha gourmet, preferência moderada por marcas reconhecidas, baixa sensibilidade a preço e interesse parcial por materiais como aço inox ou acabamento fosco. Essas dimensões não se encaixam bem em classificações rígidas do tipo gosta ou não gosta. A teoria dos conjuntos fuzzy oferece uma forma mais adequada de representar esse comportamento, pois permite atribuir graus de pertinência a conceitos linguísticos como preço alto, avaliação excelente, produto premium, popularidade média ou compatibilidade elevada (YAGER, 2003).</w:t>
+        <w:t>Outro problema aparece na natureza da preferência. A intenção de compra em produtos de alto padrão não é binária. Um usuário pode ter alta afinidade por cozinha gourmet, preferência moderada por marcas reconhecidas, baixa sensibilidade a preço e interesse parcial por materiais como aço inox ou acabamento fosco. Essas dimensões não se encaixam bem em classificações rígidas do tipo gosta ou não gosta. A teoria dos conjuntos fuzzy oferece uma forma mais adequada de representar esse comportamento, pois permite atribuir graus de pertinência a conceitos linguísticos como preço alto, avaliação excelente, produto de alto padrão, popularidade média ou compatibilidade elevada (Yager, 2003).</w:t>
       </w:r>
     </w:p>
     <w:p>
@@ -102,7 +102,7 @@
           <w:b w:val="0"/>
           <w:sz w:val="24"/>
         </w:rPr>
-        <w:t>Ontologias de domínio complementam essa representação. Um sistema baseado apenas em ratings observa interações, mas não compreende a estrutura semântica do catálogo. Já uma ontologia permite explicitar relações entre produto, categoria, ambiente, material, marca, função e perfil de usuário. Uma cafeteira espresso, por exemplo, pode ser modelada como produto de cozinha e área gourmet, associada a eletrodoméstico compacto, uso doméstico premium, faixa de preço elevada e atributos de design. Essa estrutura cria uma base para inferir recomendações mesmo quando o histórico de interação é limitado, aproximando a recomendação de abordagens baseadas em conhecimento e modelagem semântica (GUO et al., 2022; HAW et al., 2024).</w:t>
+        <w:t>Ontologias de domínio complementam essa representação. Um sistema baseado apenas em ratings observa interações, mas não compreende a estrutura semântica do catálogo. Já uma ontologia permite explicitar relações entre produto, categoria, ambiente, material, marca, função e perfil de usuário. Uma cafeteira espresso, por exemplo, pode ser modelada como produto de cozinha e área gourmet, associada a eletrodoméstico compacto, uso doméstico de alto padrão, faixa de preço elevada e atributos de design. Essa estrutura cria uma base para inferir recomendações mesmo quando o histórico de interação é limitado, aproximando a recomendação de abordagens baseadas em conhecimento e modelagem semântica (Guo et al., 2022; Haw et al., 2024).</w:t>
       </w:r>
     </w:p>
     <w:p>
@@ -117,7 +117,7 @@
           <w:b w:val="0"/>
           <w:sz w:val="24"/>
         </w:rPr>
-        <w:t>O presente trabalho parte dessa interseção: recomendação personalizada, lógica fuzzy e ontologias aplicadas a comércio eletrônico. Trabalhos como os de Karthik e Ganapathy (2021) e Haw et al. (2024) indicam que a combinação entre conhecimento de domínio, ontologias e técnicas de recomendação pode apoiar sistemas mais interpretáveis em e-commerce. O recorte empírico adota o dataset Amazon Reviews 2023, no subconjunto Home and Kitchen, por sua proximidade com o domínio de produtos residenciais, cozinha, área gourmet e banheiro (HOU et al., 2023). A escolha não pressupõe que o dataset classifique oficialmente itens como luxo. O conceito de produto premium será tratado como uma construção operacional, derivada de atributos observáveis como preço relativo, avaliação média, número de avaliações, marca, categoria, materiais e termos associados a acabamento, design ou qualidade percebida.</w:t>
+        <w:t>O presente trabalho parte dessa interseção: recomendação personalizada, lógica fuzzy e ontologias aplicadas a comércio eletrônico. Trabalhos como os de Karthik e Ganapathy (2021) e Haw et al. (2024) indicam que a combinação entre conhecimento de domínio, ontologias e técnicas de recomendação pode apoiar sistemas mais interpretáveis em comércio eletrônico. O recorte empírico adota o dataset Amazon Reviews 2023, no subconjunto Home and Kitchen, por sua proximidade com o domínio de produtos residenciais, cozinha, área gourmet e banheiro (Hou et al., 2023). A escolha não pressupõe que o dataset classifique oficialmente itens como luxo. O conceito de produto de alto padrão será tratado como uma construção operacional, derivada de atributos observáveis como preço relativo, avaliação média, número de avaliações, marca, categoria, materiais e termos associados a acabamento, design ou qualidade percebida.</w:t>
       </w:r>
     </w:p>
     <w:p>
@@ -146,7 +146,7 @@
           <w:b w:val="0"/>
           <w:sz w:val="24"/>
         </w:rPr>
-        <w:t>A justificativa deste trabalho está na limitação prática dos recomendadores tradicionais quando aplicados a catálogos especializados. A filtragem colaborativa funciona melhor quando há massa crítica de interações. Em e-commerce premium, essa massa crítica costuma ser irregular. Produtos caros recebem menos avaliações, usuários compram com menor frequência e a comparação entre itens envolve atributos subjetivos que não aparecem diretamente na matriz de ratings. O resultado é um risco técnico claro: o sistema pode privilegiar popularidade genérica em vez de compatibilidade real com o perfil do usuário. A literatura clássica já aponta que sistemas de recomendação precisam combinar diferentes fontes de informação quando uma única técnica não representa adequadamente o problema (ADOMAVICIUS; TUZHILIN, 2005; BURKE, 2002).</w:t>
+        <w:t>A justificativa deste trabalho está na limitação prática dos recomendadores tradicionais quando aplicados a catálogos especializados. A filtragem colaborativa funciona melhor quando há massa crítica de interações. No comércio eletrônico de alto padrão, essa massa crítica costuma ser irregular. Produtos caros recebem menos avaliações, usuários compram com menor frequência e a comparação entre itens envolve atributos subjetivos que não aparecem diretamente na matriz de ratings. O resultado é um risco técnico claro: o sistema pode privilegiar popularidade genérica em vez de compatibilidade real com o perfil do usuário. A literatura clássica já aponta que sistemas de recomendação precisam combinar diferentes fontes de informação quando uma única técnica não representa adequadamente o problema (Adomavicius; Tuzhilin, 2005; Burke, 2002).</w:t>
       </w:r>
     </w:p>
     <w:p>
@@ -161,7 +161,7 @@
           <w:b w:val="0"/>
           <w:sz w:val="24"/>
         </w:rPr>
-        <w:t>Esse risco é mais relevante quando o produto recomendado possui alto valor financeiro. Uma recomendação inadequada de item simples pode gerar apenas baixo engajamento. Uma recomendação inadequada de produto premium pode comprometer a percepção de qualidade da plataforma. Nesse tipo de mercado, confiança e explicabilidade importam. O usuário precisa reconhecer algum sentido na recomendação: categoria compatível, ambiente de uso coerente, faixa de preço aceitável, avaliação positiva, material desejado ou proximidade com produtos anteriormente demonstrados como relevantes. A explicabilidade em sistemas de recomendação é tratada como fator relevante para transparência e aceitação das sugestões (ZHANG; CHEN, 2020).</w:t>
+        <w:t>Esse risco é mais relevante quando o produto recomendado possui alto valor financeiro. Uma recomendação inadequada de item simples pode gerar apenas baixo engajamento. Uma recomendação inadequada de produto de alto padrão pode comprometer a percepção de qualidade da plataforma. Nesse tipo de mercado, confiança e explicabilidade importam. O usuário precisa reconhecer algum sentido na recomendação: categoria compatível, ambiente de uso coerente, faixa de preço aceitável, avaliação positiva, material desejado ou proximidade com produtos anteriormente demonstrados como relevantes. A explicabilidade em sistemas de recomendação é tratada como fator relevante para transparência e aceitação das sugestões (Zhang; Chen, 2020).</w:t>
       </w:r>
     </w:p>
     <w:p>
@@ -176,7 +176,7 @@
           <w:b w:val="0"/>
           <w:sz w:val="24"/>
         </w:rPr>
-        <w:t>A lógica fuzzy contribui justamente nesse ponto. Ela permite modelar a gradualidade da intenção de compra sem forçar fronteiras artificiais. Um produto pode ser parcialmente premium, não apenas premium ou não premium. Um usuário pode ter média afinidade por uma categoria e alta afinidade por determinado ambiente. A recomendação pode combinar esses graus e produzir um escore de compatibilidade mais expressivo do que uma regra rígida. A abordagem também permite controlar situações de risco. Se o produto possui preço premium e a confiança no perfil do usuário é baixa, a recomendação pode receber prioridade moderada, ainda que sua avaliação média seja alta. Esse tipo de raciocínio é coerente com o uso da lógica fuzzy em sistemas de recomendação (YAGER, 2003; KARTHIK; GANAPATHY, 2021).</w:t>
+        <w:t>A lógica fuzzy contribui justamente nesse ponto. Ela permite modelar a gradualidade da intenção de compra sem forçar fronteiras artificiais. Um produto pode ser parcialmente de alto padrão, não apenas de alto padrão ou fora desse perfil. Um usuário pode ter média afinidade por uma categoria e alta afinidade por determinado ambiente. A recomendação pode combinar esses graus e produzir um escore de compatibilidade mais expressivo do que uma regra rígida. A abordagem também permite controlar situações de risco. Se o produto possui preço elevado e a confiança no perfil do usuário é baixa, a recomendação pode receber prioridade moderada, ainda que sua avaliação média seja alta. Esse tipo de raciocínio é coerente com o uso da lógica fuzzy em sistemas de recomendação (Yager, 2003; Karthik; Ganapathy, 2021).</w:t>
       </w:r>
     </w:p>
     <w:p>
@@ -191,7 +191,7 @@
           <w:b w:val="0"/>
           <w:sz w:val="24"/>
         </w:rPr>
-        <w:t>A ontologia agrega uma segunda camada de valor. Ela organiza o conhecimento de domínio e permite que o sistema utilize relações semânticas para compensar a falta de interações. Em cenários de cold start, essa característica é decisiva. Um usuário com apenas uma avaliação positiva em Coffee, Tea &amp; Espresso pode ainda receber recomendações relacionadas a cozinha gourmet, eletrodomésticos premium ou acessórios compatíveis, desde que a proximidade semântica esteja representada. O sistema deixa de depender exclusivamente de usuários semelhantes e passa a usar conhecimento estruturado sobre produtos, princípio associado a sistemas baseados em conhecimento e recomendação semântica (GUO et al., 2022; HAW et al., 2024).</w:t>
+        <w:t>A ontologia agrega uma segunda camada de valor. Ela organiza o conhecimento de domínio e permite que o sistema utilize relações semânticas para compensar a falta de interações. Em cenários de cold start, essa característica é decisiva. Um usuário com apenas uma avaliação positiva em Coffee, Tea &amp; Espresso pode ainda receber recomendações relacionadas a cozinha gourmet, eletrodomésticos de alto padrão ou acessórios compatíveis, desde que a proximidade semântica esteja representada. O sistema deixa de depender exclusivamente de usuários semelhantes e passa a usar conhecimento estruturado sobre produtos, princípio associado a sistemas baseados em conhecimento e recomendação semântica (Guo et al., 2022; Haw et al., 2024).</w:t>
       </w:r>
     </w:p>
     <w:p>
@@ -206,7 +206,7 @@
           <w:b w:val="0"/>
           <w:sz w:val="24"/>
         </w:rPr>
-        <w:t>A escolha do Amazon Reviews 2023 - Home and Kitchen se justifica por oferecer uma base pública e ampla para simular um ambiente de varejo digital. O subconjunto selecionado contém categorias próximas ao domínio de interesse, como Kitchen &amp; Dining, Small Appliances, Coffee, Tea &amp; Espresso, Cookware, Dining &amp; Entertaining, Bath e Bathroom Accessories, desde que confirmadas no schema real utilizado. Esse recorte permite construir uma ponte metodológica entre uma base pública e o contexto de uma empresa de nicho, como a Kouzina Club, sem depender de dados proprietários sensíveis. O uso de dados públicos também favorece reprodutibilidade experimental, desde que o recorte, os filtros e os parâmetros sejam documentados (HOU et al., 2023).</w:t>
+        <w:t>A escolha do Amazon Reviews 2023 - Home and Kitchen se justifica por oferecer uma base pública e ampla para simular um ambiente de varejo digital. O subconjunto selecionado contém categorias próximas ao domínio de interesse, como Kitchen &amp; Dining, Small Appliances, Coffee, Tea &amp; Espresso, Cookware, Dining &amp; Entertaining, Bath e Bathroom Accessories, desde que confirmadas no schema real utilizado. Esse recorte permite construir uma ponte metodológica entre uma base pública e o contexto de uma empresa de nicho, como a Kouzina Club, sem depender de dados proprietários sensíveis. O uso de dados públicos também favorece reprodutibilidade experimental, desde que o recorte, os filtros e os parâmetros sejam documentados (Hou et al., 2023).</w:t>
       </w:r>
     </w:p>
     <w:p>
@@ -221,7 +221,7 @@
           <w:b w:val="0"/>
           <w:sz w:val="24"/>
         </w:rPr>
-        <w:t>A motivação acadêmica também é direta. A literatura sobre sistemas de recomendação registra limitações recorrentes associadas a cold start, esparsidade, baixa interpretabilidade e dificuldade de representar preferências graduais (YUAN; HERNANDEZ, 2023; ZHANG; CHEN, 2020). Trabalhos sobre ontologias fuzzy e recomendação baseada em conhecimento indicam caminhos promissores, mas ainda há espaço para investigar uma solução aplicada a e-commerce especializado em produtos premium para casa, cozinha, área gourmet e banheiro (KARTHIK; GANAPATHY, 2021; HAW et al., 2024). O trabalho busca ocupar esse espaço com um protótipo avaliável, documentado e comparável a baselines simples.</w:t>
+        <w:t>A motivação acadêmica também é direta. A literatura sobre sistemas de recomendação registra limitações recorrentes associadas a cold start, esparsidade, baixa interpretabilidade e dificuldade de representar preferências graduais (Yuan; Hernandez, 2023; Zhang; Chen, 2020). Trabalhos sobre ontologias fuzzy e recomendação baseada em conhecimento indicam caminhos promissores, mas ainda há espaço para investigar uma solução aplicada a comércio eletrônico especializado em produtos de alto padrão para casa, cozinha, área gourmet e banheiro (Karthik; Ganapathy, 2021; Haw et al., 2024). O trabalho busca ocupar esse espaço com um protótipo avaliável, documentado e comparável a baselines simples.</w:t>
       </w:r>
     </w:p>
     <w:p>
@@ -250,7 +250,7 @@
           <w:b w:val="0"/>
           <w:sz w:val="24"/>
         </w:rPr>
-        <w:t>O objetivo geral deste trabalho é desenvolver e avaliar um sistema de recomendação híbrido baseado em ontologias fuzzy, capaz de modelar preferências graduais de usuários e gerar recomendações personalizadas em um contexto de comércio eletrônico voltado a produtos residenciais premium. A caracterização do sistema como híbrido decorre da combinação entre conhecimento de domínio, regras fuzzy, perfis de usuário e técnicas de ranking, alinhando-se à noção de integração de métodos em sistemas recomendadores (BURKE, 2002).</w:t>
+        <w:t>O objetivo geral deste trabalho é desenvolver e avaliar um sistema de recomendação híbrido baseado em ontologias fuzzy, capaz de modelar preferências graduais de usuários e gerar recomendações personalizadas em um contexto de comércio eletrônico voltado a produtos residenciais de alto padrão. A caracterização do sistema como híbrido decorre da combinação entre conhecimento de domínio, regras fuzzy, perfis de usuário e técnicas de ranking, alinhando-se à noção de integração de métodos em sistemas recomendadores (Burke, 2002).</w:t>
       </w:r>
     </w:p>
     <w:p>
@@ -280,7 +280,7 @@
           <w:b w:val="0"/>
           <w:sz w:val="24"/>
         </w:rPr>
-        <w:t>a) investigar os fundamentos de sistemas de recomendação, filtragem colaborativa, recomendação baseada em conteúdo, lógica fuzzy, ontologias de domínio e estratégias para mitigação de cold start (ADOMAVICIUS; TUZHILIN, 2005; YAGER, 2003; YUAN; HERNANDEZ, 2023);</w:t>
+        <w:t>a) investigar os fundamentos de sistemas de recomendação, filtragem colaborativa, recomendação baseada em conteúdo, lógica fuzzy, ontologias de domínio e estratégias para mitigação de cold start (Adomavicius; Tuzhilin, 2005; Yager, 2003; Yuan; Hernandez, 2023);</w:t>
       </w:r>
     </w:p>
     <w:p>
@@ -295,7 +295,7 @@
           <w:b w:val="0"/>
           <w:sz w:val="24"/>
         </w:rPr>
-        <w:t>b) selecionar e preparar um recorte do dataset Amazon Reviews 2023 - Home and Kitchen compatível com produtos de cozinha, área gourmet, eletrodomésticos, utensílios premium, decoração funcional e banheiro (HOU et al., 2023);</w:t>
+        <w:t>b) selecionar e preparar um recorte do dataset Amazon Reviews 2023 - Home and Kitchen compatível com produtos de cozinha, área gourmet, eletrodomésticos, utensílios de alto padrão, decoração funcional e banheiro (Hou et al., 2023);</w:t>
       </w:r>
     </w:p>
     <w:p>
@@ -310,7 +310,7 @@
           <w:b w:val="0"/>
           <w:sz w:val="24"/>
         </w:rPr>
-        <w:t>c) definir uma representação operacional para produto premium/luxo, baseada em critérios observáveis como preço relativo, avaliação, popularidade, marca, categoria, materiais e atributos textuais;</w:t>
+        <w:t>c) definir uma representação operacional para produto de alto padrão/luxo, baseada em critérios observáveis como preço relativo, avaliação, popularidade, marca, categoria, materiais e atributos textuais;</w:t>
       </w:r>
     </w:p>
     <w:p>
@@ -325,7 +325,7 @@
           <w:b w:val="0"/>
           <w:sz w:val="24"/>
         </w:rPr>
-        <w:t>d) modelar uma ontologia inicial de produtos, contemplando entidades como usuário, produto, categoria, ambiente, marca, faixa de preço, avaliação, atributo, material, estilo, função, preferência e recomendação (HAW et al., 2024);</w:t>
+        <w:t>d) modelar uma ontologia inicial de produtos, contemplando entidades como usuário, produto, categoria, ambiente, marca, faixa de preço, avaliação, atributo, material, estilo, função, preferência e recomendação (Haw et al., 2024);</w:t>
       </w:r>
     </w:p>
     <w:p>
@@ -340,7 +340,7 @@
           <w:b w:val="0"/>
           <w:sz w:val="24"/>
         </w:rPr>
-        <w:t>e) construir perfis fuzzy de usuários a partir de interações positivas, negativas ou neutras, considerando afinidade por categoria, ambiente, marca, faixa de preço, popularidade e compatibilidade com produtos premium (KARTHIK; GANAPATHY, 2021);</w:t>
+        <w:t>e) construir perfis fuzzy de usuários a partir de interações positivas, negativas ou neutras, considerando afinidade por categoria, ambiente, marca, faixa de preço, popularidade e compatibilidade com produtos de alto padrão (Karthik; Ganapathy, 2021);</w:t>
       </w:r>
     </w:p>
     <w:p>
@@ -355,7 +355,7 @@
           <w:b w:val="0"/>
           <w:sz w:val="24"/>
         </w:rPr>
-        <w:t>f) implementar um motor de inferência fuzzy para calcular escores de compatibilidade entre usuários e produtos candidatos (YAGER, 2003);</w:t>
+        <w:t>f) implementar um motor de inferência fuzzy para calcular escores de compatibilidade entre usuários e produtos candidatos (Yager, 2003);</w:t>
       </w:r>
     </w:p>
     <w:p>
@@ -370,7 +370,7 @@
           <w:b w:val="0"/>
           <w:sz w:val="24"/>
         </w:rPr>
-        <w:t>g) gerar rankings Top-N acompanhados de explicações textuais, indicando os fatores que contribuíram para cada recomendação (ZHANG; CHEN, 2020);</w:t>
+        <w:t>g) gerar rankings Top-N acompanhados de explicações textuais, indicando os fatores que contribuíram para cada recomendação (Zhang; Chen, 2020);</w:t>
       </w:r>
     </w:p>
     <w:p>
@@ -385,7 +385,7 @@
           <w:b w:val="0"/>
           <w:sz w:val="24"/>
         </w:rPr>
-        <w:t>h) comparar o modelo proposto com baselines como popularidade, recomendação por categoria preferida, abordagem content-based simples e, se o escopo permitir, filtragem colaborativa (ISINKAYE; FOLAJIMI; OJOKOH, 2015);</w:t>
+        <w:t>h) comparar o modelo proposto com baselines como popularidade, recomendação por categoria preferida, abordagem baseada em conteúdo simples e, se o escopo permitir, filtragem colaborativa (Isinkaye; Folajimi; Ojokoh, 2015);</w:t>
       </w:r>
     </w:p>
     <w:p>
@@ -400,7 +400,7 @@
           <w:b w:val="0"/>
           <w:sz w:val="24"/>
         </w:rPr>
-        <w:t>i) avaliar os resultados por métricas adequadas a recomendação Top-N, como Precision@K, Recall@K, NDCG@K, Hit Rate@K e Coverage, incluindo cenários gerais e cenários de cold start (YUAN; HERNANDEZ, 2023).</w:t>
+        <w:t>i) avaliar os resultados por métricas adequadas a recomendação Top-N, como Precision@K, Recall@K, NDCG@K, Hit Rate@K e Coverage, incluindo cenários gerais e cenários de cold start (Yuan; Hernandez, 2023).</w:t>
       </w:r>
     </w:p>
     <w:p>
@@ -459,7 +459,7 @@
           <w:b w:val="0"/>
           <w:sz w:val="24"/>
         </w:rPr>
-        <w:t>O terceiro capítulo apresenta os trabalhos relacionados. A análise considera estudos sobre recomendação fuzzy, ontologias aplicadas a perfis de usuário, sistemas de recomendação semânticos, estratégias para cold start e soluções voltadas a e-commerce. A comparação busca identificar lacunas técnicas e metodológicas que justifiquem o modelo proposto.</w:t>
+        <w:t>O terceiro capítulo apresenta os trabalhos relacionados. A análise considera estudos sobre recomendação fuzzy, ontologias aplicadas a perfis de usuário, sistemas de recomendação semânticos, estratégias para cold start e soluções voltadas a comércio eletrônico. A comparação busca identificar lacunas técnicas e metodológicas que justifiquem o modelo proposto.</w:t>
       </w:r>
     </w:p>
     <w:p>

</xml_diff>

<commit_message>
Refine introduction content and update references in Capitulo_1_Introducao.md; modify export script to read from updated markdown file path
</commit_message>
<xml_diff>
--- a/outputs/Capitulo_1_Introducao.docx
+++ b/outputs/Capitulo_1_Introducao.docx
@@ -42,7 +42,7 @@
           <w:b w:val="0"/>
           <w:sz w:val="24"/>
         </w:rPr>
-        <w:t>Sistemas de recomendação ocupam posição estratégica em plataformas de comércio eletrônico porque reduzem o custo cognitivo da escolha. O usuário raramente percorre todo o catálogo disponível; ele navega por uma fração limitada de produtos, compara poucos atributos e decide a partir de sinais incompletos. Para a loja, a recomendação atua como mecanismo de organização do catálogo, exposição de itens relevantes e aumento de aderência entre intenção de compra e oferta. O problema deixa de ser apenas apresentar produtos populares. A tarefa técnica passa a ser interpretar preferências, inferir contexto e ordenar alternativas sob incerteza, aspecto recorrente na literatura de sistemas de recomendação (Adomavicius; Tuzhilin, 2005; Isinkaye; Folajimi; Ojokoh, 2015).</w:t>
+        <w:t>Sistemas de recomendação ocupam posição estratégica em plataformas de comércio eletrônico porque reduzem o custo cognitivo da escolha. O usuário raramente percorre todo o catálogo disponível; ele navega por uma fração limitada de produtos, compara poucos atributos e decide a partir de sinais incompletos. Para a loja, a recomendação atua como mecanismo de organização do catálogo, exposição de itens relevantes e aumento de aderência entre intenção de compra e oferta. O problema deixa de ser apenas apresentar produtos populares. A tarefa técnica passa a ser interpretar preferências, inferir contexto e ordenar alternativas sob incerteza, aspecto recorrente na literatura de sistemas de recomendação (ADOMAVICIUS; TUZHILIN, 2005; ISINKAYE; FOLAJIMI; OJOKOH, 2015).</w:t>
       </w:r>
     </w:p>
     <w:p>
@@ -57,7 +57,7 @@
           <w:b w:val="0"/>
           <w:sz w:val="24"/>
         </w:rPr>
-        <w:t>Modelos tradicionais de recomendação, especialmente os baseados em filtragem colaborativa, dependem de padrões recorrentes de interação entre usuários e itens. Essa dependência produz bons resultados quando há grande volume de avaliações, compras, cliques ou visualizações. O desempenho se fragiliza quando a matriz usuário-item é esparsa. Esse ponto é crítico em mercados de nicho, como comércios eletrônicos de produtos residenciais de alto padrão. Um catálogo de alto padrão, semelhante ao domínio de atuação da Kouzina Club, tende a envolver itens de maior valor financeiro, ciclos de compra mais longos e menor repetição transacional. O usuário não compra uma adega climatizada, uma cafeteira de alto padrão ou um conjunto de metais de banheiro com a mesma frequência com que compra itens de consumo recorrente.</w:t>
+        <w:t>Modelos tradicionais de recomendação, especialmente os baseados em filtragem colaborativa, dependem de padrões recorrentes de interação entre usuários e itens. Essa dependência produz bons resultados quando há grande volume de avaliações, compras, cliques ou visualizações. O desempenho se fragiliza quando a matriz usuário-item é esparsa. Esse ponto é crítico em mercados de nicho, como e-commerces de produtos residenciais de alto padrão. Um catálogo premium, semelhante ao domínio de atuação da Kouzina Club, tende a envolver itens de maior valor financeiro, ciclos de compra mais longos e menor repetição transacional. O usuário não compra uma adega climatizada, uma cafeteira premium ou um conjunto de metais de banheiro com a mesma frequência com que compra itens de consumo recorrente.</w:t>
       </w:r>
     </w:p>
     <w:p>
@@ -87,7 +87,7 @@
           <w:b w:val="0"/>
           <w:sz w:val="24"/>
         </w:rPr>
-        <w:t>Outro problema aparece na natureza da preferência. A intenção de compra em produtos de alto padrão não é binária. Um usuário pode ter alta afinidade por cozinha gourmet, preferência moderada por marcas reconhecidas, baixa sensibilidade a preço e interesse parcial por materiais como aço inox ou acabamento fosco. Essas dimensões não se encaixam bem em classificações rígidas do tipo gosta ou não gosta. A teoria dos conjuntos fuzzy oferece uma forma mais adequada de representar esse comportamento, pois permite atribuir graus de pertinência a conceitos linguísticos como preço alto, avaliação excelente, produto de alto padrão, popularidade média ou compatibilidade elevada (Yager, 2003).</w:t>
+        <w:t>Outro problema aparece na natureza da preferência. A intenção de compra em produtos premium não é binária. Um usuário pode ter alta afinidade por cozinha gourmet, preferência moderada por marcas reconhecidas, baixa sensibilidade a preço e interesse parcial por materiais como aço inox ou acabamento fosco. Essas dimensões não se encaixam bem em classificações rígidas do tipo gosta ou não gosta. A teoria dos conjuntos fuzzy oferece uma forma mais adequada de representar esse comportamento, pois permite atribuir graus de pertinência a conceitos linguísticos como preço alto, avaliação excelente, produto premium, popularidade média ou compatibilidade elevada (JAIN; GUPTA, 2018).</w:t>
       </w:r>
     </w:p>
     <w:p>
@@ -102,7 +102,7 @@
           <w:b w:val="0"/>
           <w:sz w:val="24"/>
         </w:rPr>
-        <w:t>Ontologias de domínio complementam essa representação. Um sistema baseado apenas em ratings observa interações, mas não compreende a estrutura semântica do catálogo. Já uma ontologia permite explicitar relações entre produto, categoria, ambiente, material, marca, função e perfil de usuário. Uma cafeteira espresso, por exemplo, pode ser modelada como produto de cozinha e área gourmet, associada a eletrodoméstico compacto, uso doméstico de alto padrão, faixa de preço elevada e atributos de design. Essa estrutura cria uma base para inferir recomendações mesmo quando o histórico de interação é limitado, aproximando a recomendação de abordagens baseadas em conhecimento e modelagem semântica (Guo et al., 2022; Haw et al., 2024).</w:t>
+        <w:t>Ontologias de domínio complementam essa representação. Um sistema baseado apenas em ratings observa interações, mas não compreende a estrutura semântica do catálogo. Já uma ontologia permite explicitar relações entre produto, categoria, ambiente, material, marca, função e perfil de usuário. Uma cafeteira espresso, por exemplo, pode ser modelada como produto de cozinha e área gourmet, associada a eletrodoméstico compacto, uso doméstico premium, faixa de preço elevada e atributos de design. Essa estrutura cria uma base para inferir recomendações mesmo quando o histórico de interação é limitado, aproximando a recomendação de abordagens baseadas em conhecimento e modelagem semântica (GUO et al., 2022; GUIA; SILVA; BERNARDINO, 2019).</w:t>
       </w:r>
     </w:p>
     <w:p>
@@ -117,7 +117,7 @@
           <w:b w:val="0"/>
           <w:sz w:val="24"/>
         </w:rPr>
-        <w:t>O presente trabalho parte dessa interseção: recomendação personalizada, lógica fuzzy e ontologias aplicadas a comércio eletrônico. Trabalhos como os de Karthik e Ganapathy (2021) e Haw et al. (2024) indicam que a combinação entre conhecimento de domínio, ontologias e técnicas de recomendação pode apoiar sistemas mais interpretáveis em comércio eletrônico. O recorte empírico adota o dataset Amazon Reviews 2023, no subconjunto Home and Kitchen, por sua proximidade com o domínio de produtos residenciais, cozinha, área gourmet e banheiro (Hou et al., 2023). A escolha não pressupõe que o dataset classifique oficialmente itens como luxo. O conceito de produto de alto padrão será tratado como uma construção operacional, derivada de atributos observáveis como preço relativo, avaliação média, número de avaliações, marca, categoria, materiais e termos associados a acabamento, design ou qualidade percebida.</w:t>
+        <w:t>O presente trabalho parte dessa interseção: recomendação personalizada, lógica fuzzy e ontologias aplicadas a comércio eletrônico. Trabalhos como os de Karthik e Ganapathy (2021) e Guia, Silva e Bernardino (2019) indicam que a combinação entre conhecimento de domínio, ontologias e técnicas de recomendação pode apoiar sistemas mais interpretáveis em e-commerce. O recorte empírico adota o dataset Amazon Reviews 2023, no subconjunto Home and Kitchen, por sua proximidade com o domínio de produtos residenciais, cozinha, área gourmet e banheiro (HOU et al., 2024). A escolha não pressupõe que o dataset classifique oficialmente itens como luxo. O conceito de produto premium será tratado como uma construção operacional, derivada de atributos observáveis como preço relativo, avaliação média, número de avaliações, marca, categoria, materiais e termos associados a acabamento, design ou qualidade percebida.</w:t>
       </w:r>
     </w:p>
     <w:p>
@@ -146,7 +146,7 @@
           <w:b w:val="0"/>
           <w:sz w:val="24"/>
         </w:rPr>
-        <w:t>A justificativa deste trabalho está na limitação prática dos recomendadores tradicionais quando aplicados a catálogos especializados. A filtragem colaborativa funciona melhor quando há massa crítica de interações. No comércio eletrônico de alto padrão, essa massa crítica costuma ser irregular. Produtos caros recebem menos avaliações, usuários compram com menor frequência e a comparação entre itens envolve atributos subjetivos que não aparecem diretamente na matriz de ratings. O resultado é um risco técnico claro: o sistema pode privilegiar popularidade genérica em vez de compatibilidade real com o perfil do usuário. A literatura clássica já aponta que sistemas de recomendação precisam combinar diferentes fontes de informação quando uma única técnica não representa adequadamente o problema (Adomavicius; Tuzhilin, 2005; Burke, 2002).</w:t>
+        <w:t>A justificativa deste trabalho está na limitação prática dos recomendadores tradicionais quando aplicados a catálogos especializados. A filtragem colaborativa funciona melhor quando há massa crítica de interações. Em e-commerce premium, essa massa crítica costuma ser irregular. Produtos caros recebem menos avaliações, usuários compram com menor frequência e a comparação entre itens envolve atributos subjetivos que não aparecem diretamente na matriz de ratings. O resultado é um risco técnico claro: o sistema pode privilegiar popularidade genérica em vez de compatibilidade real com o perfil do usuário. A literatura clássica já aponta que sistemas de recomendação precisam combinar diferentes fontes de informação quando uma única técnica não representa adequadamente o problema (ADOMAVICIUS; TUZHILIN, 2005; BURKE, 2002).</w:t>
       </w:r>
     </w:p>
     <w:p>
@@ -161,7 +161,7 @@
           <w:b w:val="0"/>
           <w:sz w:val="24"/>
         </w:rPr>
-        <w:t>Esse risco é mais relevante quando o produto recomendado possui alto valor financeiro. Uma recomendação inadequada de item simples pode gerar apenas baixo engajamento. Uma recomendação inadequada de produto de alto padrão pode comprometer a percepção de qualidade da plataforma. Nesse tipo de mercado, confiança e explicabilidade importam. O usuário precisa reconhecer algum sentido na recomendação: categoria compatível, ambiente de uso coerente, faixa de preço aceitável, avaliação positiva, material desejado ou proximidade com produtos anteriormente demonstrados como relevantes. A explicabilidade em sistemas de recomendação é tratada como fator relevante para transparência e aceitação das sugestões (Zhang; Chen, 2020).</w:t>
+        <w:t>Esse risco é mais relevante quando o produto recomendado possui alto valor financeiro. Uma recomendação inadequada de item simples pode gerar apenas baixo engajamento. Uma recomendação inadequada de produto premium pode comprometer a percepção de qualidade da plataforma. Nesse tipo de mercado, confiança e explicabilidade importam. O usuário precisa reconhecer algum sentido na recomendação: categoria compatível, ambiente de uso coerente, faixa de preço aceitável, avaliação positiva, material desejado ou proximidade com produtos anteriormente demonstrados como relevantes. A explicabilidade em sistemas de recomendação é tratada como fator relevante para transparência e aceitação das sugestões (ZHANG; CHEN, 2020).</w:t>
       </w:r>
     </w:p>
     <w:p>
@@ -176,7 +176,7 @@
           <w:b w:val="0"/>
           <w:sz w:val="24"/>
         </w:rPr>
-        <w:t>A lógica fuzzy contribui justamente nesse ponto. Ela permite modelar a gradualidade da intenção de compra sem forçar fronteiras artificiais. Um produto pode ser parcialmente de alto padrão, não apenas de alto padrão ou fora desse perfil. Um usuário pode ter média afinidade por uma categoria e alta afinidade por determinado ambiente. A recomendação pode combinar esses graus e produzir um escore de compatibilidade mais expressivo do que uma regra rígida. A abordagem também permite controlar situações de risco. Se o produto possui preço elevado e a confiança no perfil do usuário é baixa, a recomendação pode receber prioridade moderada, ainda que sua avaliação média seja alta. Esse tipo de raciocínio é coerente com o uso da lógica fuzzy em sistemas de recomendação (Yager, 2003; Karthik; Ganapathy, 2021).</w:t>
+        <w:t>A lógica fuzzy contribui justamente nesse ponto. Ela permite modelar a gradualidade da intenção de compra sem forçar fronteiras artificiais. Um produto pode ser parcialmente premium, não apenas premium ou não premium. Um usuário pode ter média afinidade por uma categoria e alta afinidade por determinado ambiente. A recomendação pode combinar esses graus e produzir um escore de compatibilidade mais expressivo do que uma regra rígida. A abordagem também permite controlar situações de risco. Se o produto possui preço premium e a confiança no perfil do usuário é baixa, a recomendação pode receber prioridade moderada, ainda que sua avaliação média seja alta. Esse tipo de raciocínio é coerente com o uso da lógica fuzzy em sistemas de recomendação (JAIN; GUPTA, 2018; KARTHIK; GANAPATHY, 2021).</w:t>
       </w:r>
     </w:p>
     <w:p>
@@ -191,7 +191,7 @@
           <w:b w:val="0"/>
           <w:sz w:val="24"/>
         </w:rPr>
-        <w:t>A ontologia agrega uma segunda camada de valor. Ela organiza o conhecimento de domínio e permite que o sistema utilize relações semânticas para compensar a falta de interações. Em cenários de cold start, essa característica é decisiva. Um usuário com apenas uma avaliação positiva em Coffee, Tea &amp; Espresso pode ainda receber recomendações relacionadas a cozinha gourmet, eletrodomésticos de alto padrão ou acessórios compatíveis, desde que a proximidade semântica esteja representada. O sistema deixa de depender exclusivamente de usuários semelhantes e passa a usar conhecimento estruturado sobre produtos, princípio associado a sistemas baseados em conhecimento e recomendação semântica (Guo et al., 2022; Haw et al., 2024).</w:t>
+        <w:t>A ontologia agrega uma segunda camada de valor. Ela organiza o conhecimento de domínio e permite que o sistema utilize relações semânticas para compensar a falta de interações. Em cenários de cold start, essa característica é decisiva. Um usuário com apenas uma avaliação positiva em Coffee, Tea &amp; Espresso pode ainda receber recomendações relacionadas a cozinha gourmet, eletrodomésticos premium ou acessórios compatíveis, desde que a proximidade semântica esteja representada. O sistema deixa de depender exclusivamente de usuários semelhantes e passa a usar conhecimento estruturado sobre produtos, princípio associado a sistemas baseados em conhecimento e recomendação semântica (GUO et al., 2022; GUIA; SILVA; BERNARDINO, 2019).</w:t>
       </w:r>
     </w:p>
     <w:p>
@@ -206,7 +206,7 @@
           <w:b w:val="0"/>
           <w:sz w:val="24"/>
         </w:rPr>
-        <w:t>A escolha do Amazon Reviews 2023 - Home and Kitchen se justifica por oferecer uma base pública e ampla para simular um ambiente de varejo digital. O subconjunto selecionado contém categorias próximas ao domínio de interesse, como Kitchen &amp; Dining, Small Appliances, Coffee, Tea &amp; Espresso, Cookware, Dining &amp; Entertaining, Bath e Bathroom Accessories, desde que confirmadas no schema real utilizado. Esse recorte permite construir uma ponte metodológica entre uma base pública e o contexto de uma empresa de nicho, como a Kouzina Club, sem depender de dados proprietários sensíveis. O uso de dados públicos também favorece reprodutibilidade experimental, desde que o recorte, os filtros e os parâmetros sejam documentados (Hou et al., 2023).</w:t>
+        <w:t>A escolha do Amazon Reviews 2023 - Home and Kitchen se justifica por oferecer uma base pública e ampla para simular um ambiente de varejo digital. A validação inicial do schema confirmou categorias próximas ao domínio de interesse, como Kitchen &amp; Dining, Dining &amp; Entertaining, Kitchen Utensils &amp; Gadgets, Storage &amp; Organization, Bath, Bathroom Accessories, Dinnerware &amp; Serveware e Glassware &amp; Drinkware, além de campos úteis como título, descrição, características, preço, avaliação média e número de avaliações. Esse recorte permite construir uma ponte metodológica entre uma base pública e o contexto de uma empresa de nicho, como a Kouzina Club, sem depender de dados proprietários sensíveis. O uso de dados públicos também favorece reprodutibilidade experimental, desde que o recorte, os filtros e os parâmetros sejam documentados (HOU et al., 2024).</w:t>
       </w:r>
     </w:p>
     <w:p>
@@ -221,7 +221,7 @@
           <w:b w:val="0"/>
           <w:sz w:val="24"/>
         </w:rPr>
-        <w:t>A motivação acadêmica também é direta. A literatura sobre sistemas de recomendação registra limitações recorrentes associadas a cold start, esparsidade, baixa interpretabilidade e dificuldade de representar preferências graduais (Yuan; Hernandez, 2023; Zhang; Chen, 2020). Trabalhos sobre ontologias fuzzy e recomendação baseada em conhecimento indicam caminhos promissores, mas ainda há espaço para investigar uma solução aplicada a comércio eletrônico especializado em produtos de alto padrão para casa, cozinha, área gourmet e banheiro (Karthik; Ganapathy, 2021; Haw et al., 2024). O trabalho busca ocupar esse espaço com um protótipo avaliável, documentado e comparável a baselines simples.</w:t>
+        <w:t>A motivação acadêmica também é direta. A literatura sobre sistemas de recomendação registra limitações recorrentes associadas a cold start, esparsidade, baixa interpretabilidade e dificuldade de representar preferências graduais (YUAN; HERNANDEZ, 2023; ZHANG; CHEN, 2020). Trabalhos sobre ontologias fuzzy e recomendação baseada em conhecimento indicam caminhos promissores, mas ainda há espaço para investigar uma solução aplicada a e-commerce especializado em produtos premium para casa, cozinha, área gourmet e banheiro (KARTHIK; GANAPATHY, 2021; GUIA; SILVA; BERNARDINO, 2019). O trabalho busca ocupar esse espaço com um protótipo avaliável, documentado e comparável a baselines simples.</w:t>
       </w:r>
     </w:p>
     <w:p>
@@ -250,7 +250,7 @@
           <w:b w:val="0"/>
           <w:sz w:val="24"/>
         </w:rPr>
-        <w:t>O objetivo geral deste trabalho é desenvolver e avaliar um sistema de recomendação híbrido baseado em ontologias fuzzy, capaz de modelar preferências graduais de usuários e gerar recomendações personalizadas em um contexto de comércio eletrônico voltado a produtos residenciais de alto padrão. A caracterização do sistema como híbrido decorre da combinação entre conhecimento de domínio, regras fuzzy, perfis de usuário e técnicas de ranking, alinhando-se à noção de integração de métodos em sistemas recomendadores (Burke, 2002).</w:t>
+        <w:t>O objetivo geral deste trabalho é desenvolver e avaliar um sistema de recomendação híbrido baseado em ontologias fuzzy, capaz de modelar preferências graduais de usuários e gerar recomendações personalizadas em um contexto de comércio eletrônico voltado a produtos residenciais premium. A caracterização do sistema como híbrido decorre da combinação entre conhecimento de domínio, regras fuzzy, perfis de usuário e técnicas de ranking, alinhando-se à noção de integração de métodos em sistemas recomendadores (BURKE, 2002).</w:t>
       </w:r>
     </w:p>
     <w:p>
@@ -280,7 +280,7 @@
           <w:b w:val="0"/>
           <w:sz w:val="24"/>
         </w:rPr>
-        <w:t>a) investigar os fundamentos de sistemas de recomendação, filtragem colaborativa, recomendação baseada em conteúdo, lógica fuzzy, ontologias de domínio e estratégias para mitigação de cold start (Adomavicius; Tuzhilin, 2005; Yager, 2003; Yuan; Hernandez, 2023);</w:t>
+        <w:t>a) investigar os fundamentos de sistemas de recomendação, filtragem colaborativa, recomendação baseada em conteúdo, lógica fuzzy, ontologias de domínio e estratégias para mitigação de cold start (ADOMAVICIUS; TUZHILIN, 2005; JAIN; GUPTA, 2018; YUAN; HERNANDEZ, 2023);</w:t>
       </w:r>
     </w:p>
     <w:p>
@@ -295,7 +295,7 @@
           <w:b w:val="0"/>
           <w:sz w:val="24"/>
         </w:rPr>
-        <w:t>b) selecionar e preparar um recorte do dataset Amazon Reviews 2023 - Home and Kitchen compatível com produtos de cozinha, área gourmet, eletrodomésticos, utensílios de alto padrão, decoração funcional e banheiro (Hou et al., 2023);</w:t>
+        <w:t>b) selecionar e preparar um recorte do dataset Amazon Reviews 2023 - Home and Kitchen compatível com produtos de cozinha, área gourmet, eletrodomésticos, utensílios premium, decoração funcional e banheiro (HOU et al., 2024);</w:t>
       </w:r>
     </w:p>
     <w:p>
@@ -310,7 +310,7 @@
           <w:b w:val="0"/>
           <w:sz w:val="24"/>
         </w:rPr>
-        <w:t>c) definir uma representação operacional para produto de alto padrão/luxo, baseada em critérios observáveis como preço relativo, avaliação, popularidade, marca, categoria, materiais e atributos textuais;</w:t>
+        <w:t>c) definir uma representação operacional para produto premium/luxo, baseada em critérios observáveis como preço relativo, avaliação, popularidade, marca, categoria, materiais e atributos textuais;</w:t>
       </w:r>
     </w:p>
     <w:p>
@@ -325,7 +325,7 @@
           <w:b w:val="0"/>
           <w:sz w:val="24"/>
         </w:rPr>
-        <w:t>d) modelar uma ontologia inicial de produtos, contemplando entidades como usuário, produto, categoria, ambiente, marca, faixa de preço, avaliação, atributo, material, estilo, função, preferência e recomendação (Haw et al., 2024);</w:t>
+        <w:t>d) modelar uma ontologia inicial de produtos, contemplando entidades como usuário, produto, categoria, ambiente, marca, faixa de preço, avaliação, atributo, material, estilo, função, preferência e recomendação (GUIA; SILVA; BERNARDINO, 2019);</w:t>
       </w:r>
     </w:p>
     <w:p>
@@ -340,7 +340,7 @@
           <w:b w:val="0"/>
           <w:sz w:val="24"/>
         </w:rPr>
-        <w:t>e) construir perfis fuzzy de usuários a partir de interações positivas, negativas ou neutras, considerando afinidade por categoria, ambiente, marca, faixa de preço, popularidade e compatibilidade com produtos de alto padrão (Karthik; Ganapathy, 2021);</w:t>
+        <w:t>e) construir perfis fuzzy de usuários a partir de interações positivas, negativas ou neutras, considerando afinidade por categoria, ambiente, marca, faixa de preço, popularidade e compatibilidade com produtos premium (KARTHIK; GANAPATHY, 2021);</w:t>
       </w:r>
     </w:p>
     <w:p>
@@ -355,7 +355,7 @@
           <w:b w:val="0"/>
           <w:sz w:val="24"/>
         </w:rPr>
-        <w:t>f) implementar um motor de inferência fuzzy para calcular escores de compatibilidade entre usuários e produtos candidatos (Yager, 2003);</w:t>
+        <w:t>f) implementar um motor de inferência fuzzy para calcular escores de compatibilidade entre usuários e produtos candidatos (JAIN; GUPTA, 2018);</w:t>
       </w:r>
     </w:p>
     <w:p>
@@ -370,7 +370,7 @@
           <w:b w:val="0"/>
           <w:sz w:val="24"/>
         </w:rPr>
-        <w:t>g) gerar rankings Top-N acompanhados de explicações textuais, indicando os fatores que contribuíram para cada recomendação (Zhang; Chen, 2020);</w:t>
+        <w:t>g) gerar rankings Top-N acompanhados de explicações textuais, indicando os fatores que contribuíram para cada recomendação (ZHANG; CHEN, 2020);</w:t>
       </w:r>
     </w:p>
     <w:p>
@@ -385,7 +385,7 @@
           <w:b w:val="0"/>
           <w:sz w:val="24"/>
         </w:rPr>
-        <w:t>h) comparar o modelo proposto com baselines como popularidade, recomendação por categoria preferida, abordagem baseada em conteúdo simples e, se o escopo permitir, filtragem colaborativa (Isinkaye; Folajimi; Ojokoh, 2015);</w:t>
+        <w:t>h) comparar o modelo proposto com baselines como popularidade, recomendação por categoria preferida, abordagem content-based simples e, se o escopo permitir, filtragem colaborativa (ISINKAYE; FOLAJIMI; OJOKOH, 2015);</w:t>
       </w:r>
     </w:p>
     <w:p>
@@ -400,7 +400,7 @@
           <w:b w:val="0"/>
           <w:sz w:val="24"/>
         </w:rPr>
-        <w:t>i) avaliar os resultados por métricas adequadas a recomendação Top-N, como Precision@K, Recall@K, NDCG@K, Hit Rate@K e Coverage, incluindo cenários gerais e cenários de cold start (Yuan; Hernandez, 2023).</w:t>
+        <w:t>i) avaliar os resultados por métricas adequadas a recomendação Top-N, como Precision@K, Recall@K, NDCG@K, Hit Rate@K e Coverage, incluindo cenários gerais e cenários de cold start (YUAN; HERNANDEZ, 2023).</w:t>
       </w:r>
     </w:p>
     <w:p>
@@ -459,7 +459,7 @@
           <w:b w:val="0"/>
           <w:sz w:val="24"/>
         </w:rPr>
-        <w:t>O terceiro capítulo apresenta os trabalhos relacionados. A análise considera estudos sobre recomendação fuzzy, ontologias aplicadas a perfis de usuário, sistemas de recomendação semânticos, estratégias para cold start e soluções voltadas a comércio eletrônico. A comparação busca identificar lacunas técnicas e metodológicas que justifiquem o modelo proposto.</w:t>
+        <w:t>O terceiro capítulo apresenta os trabalhos relacionados. A análise considera estudos sobre recomendação fuzzy, ontologias aplicadas a perfis de usuário, sistemas de recomendação semânticos, estratégias para cold start e soluções voltadas a e-commerce. A comparação busca identificar lacunas técnicas e metodológicas que justifiquem o modelo proposto.</w:t>
       </w:r>
     </w:p>
     <w:p>
@@ -474,7 +474,7 @@
           <w:b w:val="0"/>
           <w:sz w:val="24"/>
         </w:rPr>
-        <w:t>O quarto capítulo descreve a metodologia. Nele são detalhados o levantamento e a preparação dos dados, o uso do Amazon Reviews 2023 - Home and Kitchen, os critérios de recorte do domínio, a construção da ontologia fuzzy, a definição das variáveis linguísticas, as regras de inferência, a arquitetura da aplicação e a estratégia de captura ou simulação de comportamento do usuário.</w:t>
+        <w:t>O quarto capítulo descreve a metodologia. Nele são detalhados o levantamento e a preparação dos dados, o uso do Amazon Reviews 2023 - Home and Kitchen, os critérios de recorte do domínio, a construção da ontologia fuzzy, a definição das variáveis linguísticas, as regras de inferência, a arquitetura do protótipo e a estratégia de extração ou simulação de preferências a partir das interações disponíveis no dataset.</w:t>
       </w:r>
     </w:p>
     <w:p>
@@ -489,7 +489,7 @@
           <w:b w:val="0"/>
           <w:sz w:val="24"/>
         </w:rPr>
-        <w:t>O quinto capítulo trata do desenvolvimento do protótipo. São descritos o motor de recomendação, a integração entre ontologia e regras fuzzy, os componentes de API, a vitrine virtual de demonstração e os mecanismos usados para gerar rankings e explicações. O foco desse capítulo é mostrar como a proposta conceitual foi transformada em artefato computacional.</w:t>
+        <w:t>O quinto capítulo trata do desenvolvimento do protótipo. São descritos o motor de recomendação, a integração entre ontologia e regras fuzzy, os componentes de processamento, os mecanismos usados para gerar rankings Top-N e as explicações associadas às recomendações. O foco desse capítulo é mostrar como a proposta conceitual foi transformada em artefato computacional avaliável.</w:t>
       </w:r>
     </w:p>
     <w:p>

</xml_diff>

<commit_message>
Add Chapter 2: Theoretical Foundation and Export Functionality
- Created 'Capitulo_2_Fundamentacao_Teorica.docx' and 'Capitulo_2_Fundamentacao_Teorica.md' with detailed content on recommendation systems, fuzzy logic, and ontologies.
- Implemented 'exportar_fundamentacao_teorica.py' to convert the markdown chapter to a Word document.
- Refactored 'exportar_introducao.py' to utilize the new export function for consistency.
- Introduced 'tcc_docx.py' for handling markdown to Word document conversion with custom styles and formatting.
</commit_message>
<xml_diff>
--- a/outputs/Capitulo_1_Introducao.docx
+++ b/outputs/Capitulo_1_Introducao.docx
@@ -4,527 +4,1438 @@
   <w:body>
     <w:p>
       <w:pPr>
-        <w:spacing w:line="360" w:lineRule="auto" w:after="120"/>
-        <w:jc w:val="center"/>
+        <w:pStyle w:val="Heading1"/>
+        <w:jc w:val="left"/>
       </w:pPr>
       <w:r>
         <w:rPr>
-          <w:rFonts w:ascii="Times New Roman" w:hAnsi="Times New Roman"/>
+          <w:rFonts w:ascii="Times New Roman" w:hAnsi="Times New Roman" w:eastAsia="Times New Roman" w:cs="Times New Roman"/>
           <w:b/>
+          <w:i w:val="0"/>
+          <w:color w:val="000000"/>
           <w:sz w:val="24"/>
+          <w:lang w:val="pt-BR"/>
         </w:rPr>
         <w:t>1 INTRODUÇÃO</w:t>
       </w:r>
     </w:p>
     <w:p>
       <w:pPr>
-        <w:spacing w:line="360" w:lineRule="auto" w:after="120"/>
+        <w:pStyle w:val="Heading2"/>
         <w:jc w:val="left"/>
       </w:pPr>
       <w:r>
         <w:rPr>
-          <w:rFonts w:ascii="Times New Roman" w:hAnsi="Times New Roman"/>
+          <w:rFonts w:ascii="Times New Roman" w:hAnsi="Times New Roman" w:eastAsia="Times New Roman" w:cs="Times New Roman"/>
           <w:b/>
-          <w:sz w:val="24"/>
+          <w:i w:val="0"/>
+          <w:color w:val="000000"/>
+          <w:sz w:val="22"/>
+          <w:lang w:val="pt-BR"/>
         </w:rPr>
-        <w:t>1.1 Contextualização do problema de pesquisa</w:t>
+        <w:t>1.1 CONTEXTUALIZAÇÃO DO PROBLEMA DE PESQUISA</w:t>
       </w:r>
     </w:p>
     <w:p>
       <w:pPr>
-        <w:spacing w:line="360" w:lineRule="auto" w:after="120"/>
         <w:ind w:firstLine="709"/>
         <w:jc w:val="both"/>
       </w:pPr>
       <w:r>
         <w:rPr>
-          <w:rFonts w:ascii="Times New Roman" w:hAnsi="Times New Roman"/>
+          <w:rFonts w:ascii="Times New Roman" w:hAnsi="Times New Roman" w:eastAsia="Times New Roman" w:cs="Times New Roman"/>
           <w:b w:val="0"/>
+          <w:i w:val="0"/>
+          <w:color w:val="000000"/>
           <w:sz w:val="24"/>
+          <w:lang w:val="pt-BR"/>
         </w:rPr>
-        <w:t>Sistemas de recomendação ocupam posição estratégica em plataformas de comércio eletrônico porque reduzem o custo cognitivo da escolha. O usuário raramente percorre todo o catálogo disponível; ele navega por uma fração limitada de produtos, compara poucos atributos e decide a partir de sinais incompletos. Para a loja, a recomendação atua como mecanismo de organização do catálogo, exposição de itens relevantes e aumento de aderência entre intenção de compra e oferta. O problema deixa de ser apenas apresentar produtos populares. A tarefa técnica passa a ser interpretar preferências, inferir contexto e ordenar alternativas sob incerteza, aspecto recorrente na literatura de sistemas de recomendação (ADOMAVICIUS; TUZHILIN, 2005; ISINKAYE; FOLAJIMI; OJOKOH, 2015).</w:t>
+        <w:t>Sistemas de recomendação ocupam posição estratégica em plataformas de comércio eletrônico porque reduzem a sobrecarga de informação e auxiliam o usuário a localizar itens compatíveis com seus interesses. O problema técnico não se limita a apresentar produtos populares: é necessário representar preferências, utilizar as informações disponíveis sobre usuários e itens e ordenar alternativas relevantes. A literatura classifica as abordagens tradicionais principalmente em recomendação baseada em conteúdo, filtragem colaborativa e métodos híbridos (Adomavicius; Tuzhilin, 2005; Isinkaye; Folajimi; Ojokoh, 2015).</w:t>
       </w:r>
     </w:p>
     <w:p>
       <w:pPr>
-        <w:spacing w:line="360" w:lineRule="auto" w:after="120"/>
         <w:ind w:firstLine="709"/>
         <w:jc w:val="both"/>
       </w:pPr>
       <w:r>
         <w:rPr>
-          <w:rFonts w:ascii="Times New Roman" w:hAnsi="Times New Roman"/>
+          <w:rFonts w:ascii="Times New Roman" w:hAnsi="Times New Roman" w:eastAsia="Times New Roman" w:cs="Times New Roman"/>
           <w:b w:val="0"/>
+          <w:i w:val="0"/>
+          <w:color w:val="000000"/>
           <w:sz w:val="24"/>
+          <w:lang w:val="pt-BR"/>
         </w:rPr>
-        <w:t>Modelos tradicionais de recomendação, especialmente os baseados em filtragem colaborativa, dependem de padrões recorrentes de interação entre usuários e itens. Essa dependência produz bons resultados quando há grande volume de avaliações, compras, cliques ou visualizações. O desempenho se fragiliza quando a matriz usuário-item é esparsa. Esse ponto é crítico em mercados de nicho, como e-commerces de produtos residenciais de alto padrão. Um catálogo premium, semelhante ao domínio de atuação da Kouzina Club, tende a envolver itens de maior valor financeiro, ciclos de compra mais longos e menor repetição transacional. O usuário não compra uma adega climatizada, uma cafeteira premium ou um conjunto de metais de banheiro com a mesma frequência com que compra itens de consumo recorrente.</w:t>
+        <w:t>Modelos baseados em filtragem colaborativa exploram padrões de avaliações ou interações, mas sua capacidade de estimar preferências diminui quando a matriz usuário-item é esparsa. Essa limitação afeta usuários e produtos com poucos registros e exige que a avaliação do sistema considere diferentes níveis de disponibilidade de dados. No recorte deste trabalho, depender exclusivamente de sinais colaborativos poderia deixar de aproveitar informações descritivas e semânticas presentes no catálogo (Adomavicius; Tuzhilin, 2005; Isinkaye; Folajimi; Ojokoh, 2015).</w:t>
       </w:r>
     </w:p>
     <w:p>
       <w:pPr>
-        <w:spacing w:line="360" w:lineRule="auto" w:after="120"/>
         <w:ind w:firstLine="709"/>
         <w:jc w:val="both"/>
       </w:pPr>
       <w:r>
         <w:rPr>
-          <w:rFonts w:ascii="Times New Roman" w:hAnsi="Times New Roman"/>
+          <w:rFonts w:ascii="Times New Roman" w:hAnsi="Times New Roman" w:eastAsia="Times New Roman" w:cs="Times New Roman"/>
           <w:b w:val="0"/>
+          <w:i w:val="0"/>
+          <w:color w:val="000000"/>
           <w:sz w:val="24"/>
+          <w:lang w:val="pt-BR"/>
         </w:rPr>
-        <w:t>A esparsidade afeta tanto usuários quanto produtos. Usuários novos ou pouco ativos não oferecem histórico suficiente para um perfil colaborativo robusto. Produtos novos, caros ou especializados podem permanecer com poucas avaliações por longos períodos. Esse é o problema de cold start, discutido de forma específica por Yuan e Hernandez (2023). Em plataformas varejistas de amplo alcance, a popularidade pode compensar parte dessa limitação. Em um mercado especializado, porém, recomendar apenas os itens mais avaliados pode distorcer a experiência, pois produtos de alto valor agregado nem sempre possuem grande volume de interações. A ausência de dados não significa ausência de relevância.</w:t>
+        <w:t xml:space="preserve">Uma manifestação específica da insuficiência de dados é o </w:t>
+      </w:r>
+      <w:r>
+        <w:rPr>
+          <w:rFonts w:ascii="Times New Roman" w:hAnsi="Times New Roman" w:eastAsia="Times New Roman" w:cs="Times New Roman"/>
+          <w:b w:val="0"/>
+          <w:i/>
+          <w:color w:val="000000"/>
+          <w:sz w:val="24"/>
+          <w:lang w:val="pt-BR"/>
+        </w:rPr>
+        <w:t>cold start</w:t>
+      </w:r>
+      <w:r>
+        <w:rPr>
+          <w:rFonts w:ascii="Times New Roman" w:hAnsi="Times New Roman" w:eastAsia="Times New Roman" w:cs="Times New Roman"/>
+          <w:b w:val="0"/>
+          <w:i w:val="0"/>
+          <w:color w:val="000000"/>
+          <w:sz w:val="24"/>
+          <w:lang w:val="pt-BR"/>
+        </w:rPr>
+        <w:t>. Usuários novos não possuem histórico suficiente para a construção de um perfil confiável, enquanto itens novos ainda não acumularam avaliações ou interações. Nesses casos, métodos que dependem apenas do histórico encontram dificuldade para estimar a relevância das recomendações, o que justifica investigar fontes adicionais de conhecimento sobre usuários e produtos (Yuan; Hernandez, 2023).</w:t>
       </w:r>
     </w:p>
     <w:p>
       <w:pPr>
-        <w:spacing w:line="360" w:lineRule="auto" w:after="120"/>
         <w:ind w:firstLine="709"/>
         <w:jc w:val="both"/>
       </w:pPr>
       <w:r>
         <w:rPr>
-          <w:rFonts w:ascii="Times New Roman" w:hAnsi="Times New Roman"/>
+          <w:rFonts w:ascii="Times New Roman" w:hAnsi="Times New Roman" w:eastAsia="Times New Roman" w:cs="Times New Roman"/>
           <w:b w:val="0"/>
+          <w:i w:val="0"/>
+          <w:color w:val="000000"/>
           <w:sz w:val="24"/>
+          <w:lang w:val="pt-BR"/>
         </w:rPr>
-        <w:t>Outro problema aparece na natureza da preferência. A intenção de compra em produtos premium não é binária. Um usuário pode ter alta afinidade por cozinha gourmet, preferência moderada por marcas reconhecidas, baixa sensibilidade a preço e interesse parcial por materiais como aço inox ou acabamento fosco. Essas dimensões não se encaixam bem em classificações rígidas do tipo gosta ou não gosta. A teoria dos conjuntos fuzzy oferece uma forma mais adequada de representar esse comportamento, pois permite atribuir graus de pertinência a conceitos linguísticos como preço alto, avaliação excelente, produto premium, popularidade média ou compatibilidade elevada (JAIN; GUPTA, 2018).</w:t>
+        <w:t xml:space="preserve">Outra questão está na natureza gradual das preferências. Um usuário pode apresentar alta afinidade por cozinha gourmet, preferência moderada por determinada faixa de preço e interesse parcial por materiais ou funcionalidades específicas. Essas dimensões não são adequadamente descritas apenas por classificações binárias. A lógica </w:t>
+      </w:r>
+      <w:r>
+        <w:rPr>
+          <w:rFonts w:ascii="Times New Roman" w:hAnsi="Times New Roman" w:eastAsia="Times New Roman" w:cs="Times New Roman"/>
+          <w:b w:val="0"/>
+          <w:i/>
+          <w:color w:val="000000"/>
+          <w:sz w:val="24"/>
+          <w:lang w:val="pt-BR"/>
+        </w:rPr>
+        <w:t>fuzzy</w:t>
+      </w:r>
+      <w:r>
+        <w:rPr>
+          <w:rFonts w:ascii="Times New Roman" w:hAnsi="Times New Roman" w:eastAsia="Times New Roman" w:cs="Times New Roman"/>
+          <w:b w:val="0"/>
+          <w:i w:val="0"/>
+          <w:color w:val="000000"/>
+          <w:sz w:val="24"/>
+          <w:lang w:val="pt-BR"/>
+        </w:rPr>
+        <w:t xml:space="preserve"> permite atribuir graus de pertinência a conceitos linguísticos, como preço alto, avaliação excelente, popularidade média ou compatibilidade elevada, e oferece recursos para representar incerteza e imprecisão em sistemas de recomendação (Jain; Gupta, 2018).</w:t>
       </w:r>
     </w:p>
     <w:p>
       <w:pPr>
-        <w:spacing w:line="360" w:lineRule="auto" w:after="120"/>
         <w:ind w:firstLine="709"/>
         <w:jc w:val="both"/>
       </w:pPr>
       <w:r>
         <w:rPr>
-          <w:rFonts w:ascii="Times New Roman" w:hAnsi="Times New Roman"/>
+          <w:rFonts w:ascii="Times New Roman" w:hAnsi="Times New Roman" w:eastAsia="Times New Roman" w:cs="Times New Roman"/>
           <w:b w:val="0"/>
+          <w:i w:val="0"/>
+          <w:color w:val="000000"/>
           <w:sz w:val="24"/>
+          <w:lang w:val="pt-BR"/>
         </w:rPr>
-        <w:t>Ontologias de domínio complementam essa representação. Um sistema baseado apenas em ratings observa interações, mas não compreende a estrutura semântica do catálogo. Já uma ontologia permite explicitar relações entre produto, categoria, ambiente, material, marca, função e perfil de usuário. Uma cafeteira espresso, por exemplo, pode ser modelada como produto de cozinha e área gourmet, associada a eletrodoméstico compacto, uso doméstico premium, faixa de preço elevada e atributos de design. Essa estrutura cria uma base para inferir recomendações mesmo quando o histórico de interação é limitado, aproximando a recomendação de abordagens baseadas em conhecimento e modelagem semântica (GUO et al., 2022; GUIA; SILVA; BERNARDINO, 2019).</w:t>
+        <w:t xml:space="preserve">Ontologias de domínio complementam essa representação ao explicitar conceitos e relações entre usuários, produtos, categorias, ambientes, materiais, marcas e funções. Em vez de utilizar somente a matriz de interações, um recomendador baseado em conhecimento pode explorar a estrutura semântica do catálogo como informação adicional. Essa organização não elimina o problema de escassez de dados, mas amplia os elementos disponíveis para comparar itens e justificar recomendações (Guia; Silva; Bernardino, 2019; Guo </w:t>
+      </w:r>
+      <w:r>
+        <w:rPr>
+          <w:rFonts w:ascii="Times New Roman" w:hAnsi="Times New Roman" w:eastAsia="Times New Roman" w:cs="Times New Roman"/>
+          <w:b w:val="0"/>
+          <w:i/>
+          <w:color w:val="000000"/>
+          <w:sz w:val="24"/>
+          <w:lang w:val="pt-BR"/>
+        </w:rPr>
+        <w:t>et al.</w:t>
+      </w:r>
+      <w:r>
+        <w:rPr>
+          <w:rFonts w:ascii="Times New Roman" w:hAnsi="Times New Roman" w:eastAsia="Times New Roman" w:cs="Times New Roman"/>
+          <w:b w:val="0"/>
+          <w:i w:val="0"/>
+          <w:color w:val="000000"/>
+          <w:sz w:val="24"/>
+          <w:lang w:val="pt-BR"/>
+        </w:rPr>
+        <w:t>, 2022).</w:t>
       </w:r>
     </w:p>
     <w:p>
       <w:pPr>
-        <w:spacing w:line="360" w:lineRule="auto" w:after="120"/>
         <w:ind w:firstLine="709"/>
         <w:jc w:val="both"/>
       </w:pPr>
       <w:r>
         <w:rPr>
-          <w:rFonts w:ascii="Times New Roman" w:hAnsi="Times New Roman"/>
+          <w:rFonts w:ascii="Times New Roman" w:hAnsi="Times New Roman" w:eastAsia="Times New Roman" w:cs="Times New Roman"/>
           <w:b w:val="0"/>
+          <w:i w:val="0"/>
+          <w:color w:val="000000"/>
           <w:sz w:val="24"/>
+          <w:lang w:val="pt-BR"/>
         </w:rPr>
-        <w:t>O presente trabalho parte dessa interseção: recomendação personalizada, lógica fuzzy e ontologias aplicadas a comércio eletrônico. Trabalhos como os de Karthik e Ganapathy (2021) e Guia, Silva e Bernardino (2019) indicam que a combinação entre conhecimento de domínio, ontologias e técnicas de recomendação pode apoiar sistemas mais interpretáveis em e-commerce. O recorte empírico adota o dataset Amazon Reviews 2023, no subconjunto Home and Kitchen, por sua proximidade com o domínio de produtos residenciais, cozinha, área gourmet e banheiro (HOU et al., 2024). A escolha não pressupõe que o dataset classifique oficialmente itens como luxo. O conceito de produto premium será tratado como uma construção operacional, derivada de atributos observáveis como preço relativo, avaliação média, número de avaliações, marca, categoria, materiais e termos associados a acabamento, design ou qualidade percebida.</w:t>
+        <w:t xml:space="preserve">O presente trabalho investiga a integração entre recomendação personalizada, lógica </w:t>
+      </w:r>
+      <w:r>
+        <w:rPr>
+          <w:rFonts w:ascii="Times New Roman" w:hAnsi="Times New Roman" w:eastAsia="Times New Roman" w:cs="Times New Roman"/>
+          <w:b w:val="0"/>
+          <w:i/>
+          <w:color w:val="000000"/>
+          <w:sz w:val="24"/>
+          <w:lang w:val="pt-BR"/>
+        </w:rPr>
+        <w:t>fuzzy</w:t>
+      </w:r>
+      <w:r>
+        <w:rPr>
+          <w:rFonts w:ascii="Times New Roman" w:hAnsi="Times New Roman" w:eastAsia="Times New Roman" w:cs="Times New Roman"/>
+          <w:b w:val="0"/>
+          <w:i w:val="0"/>
+          <w:color w:val="000000"/>
+          <w:sz w:val="24"/>
+          <w:lang w:val="pt-BR"/>
+        </w:rPr>
+        <w:t xml:space="preserve"> e ontologias no comércio eletrônico. O recorte empírico utiliza o </w:t>
+      </w:r>
+      <w:r>
+        <w:rPr>
+          <w:rFonts w:ascii="Times New Roman" w:hAnsi="Times New Roman" w:eastAsia="Times New Roman" w:cs="Times New Roman"/>
+          <w:b w:val="0"/>
+          <w:i/>
+          <w:color w:val="000000"/>
+          <w:sz w:val="24"/>
+          <w:lang w:val="pt-BR"/>
+        </w:rPr>
+        <w:t>dataset</w:t>
+      </w:r>
+      <w:r>
+        <w:rPr>
+          <w:rFonts w:ascii="Times New Roman" w:hAnsi="Times New Roman" w:eastAsia="Times New Roman" w:cs="Times New Roman"/>
+          <w:b w:val="0"/>
+          <w:i w:val="0"/>
+          <w:color w:val="000000"/>
+          <w:sz w:val="24"/>
+          <w:lang w:val="pt-BR"/>
+        </w:rPr>
+        <w:t xml:space="preserve"> Amazon Reviews 2023, no subconjunto </w:t>
+      </w:r>
+      <w:r>
+        <w:rPr>
+          <w:rFonts w:ascii="Times New Roman" w:hAnsi="Times New Roman" w:eastAsia="Times New Roman" w:cs="Times New Roman"/>
+          <w:b w:val="0"/>
+          <w:i/>
+          <w:color w:val="000000"/>
+          <w:sz w:val="24"/>
+          <w:lang w:val="pt-BR"/>
+        </w:rPr>
+        <w:t>Home and Kitchen</w:t>
+      </w:r>
+      <w:r>
+        <w:rPr>
+          <w:rFonts w:ascii="Times New Roman" w:hAnsi="Times New Roman" w:eastAsia="Times New Roman" w:cs="Times New Roman"/>
+          <w:b w:val="0"/>
+          <w:i w:val="0"/>
+          <w:color w:val="000000"/>
+          <w:sz w:val="24"/>
+          <w:lang w:val="pt-BR"/>
+        </w:rPr>
+        <w:t xml:space="preserve">, por sua proximidade com produtos residenciais, cozinha, área gourmet e banheiro (Hou </w:t>
+      </w:r>
+      <w:r>
+        <w:rPr>
+          <w:rFonts w:ascii="Times New Roman" w:hAnsi="Times New Roman" w:eastAsia="Times New Roman" w:cs="Times New Roman"/>
+          <w:b w:val="0"/>
+          <w:i/>
+          <w:color w:val="000000"/>
+          <w:sz w:val="24"/>
+          <w:lang w:val="pt-BR"/>
+        </w:rPr>
+        <w:t>et al.</w:t>
+      </w:r>
+      <w:r>
+        <w:rPr>
+          <w:rFonts w:ascii="Times New Roman" w:hAnsi="Times New Roman" w:eastAsia="Times New Roman" w:cs="Times New Roman"/>
+          <w:b w:val="0"/>
+          <w:i w:val="0"/>
+          <w:color w:val="000000"/>
+          <w:sz w:val="24"/>
+          <w:lang w:val="pt-BR"/>
+        </w:rPr>
+        <w:t xml:space="preserve">, 2024). A base não classifica oficialmente itens como luxo ou </w:t>
+      </w:r>
+      <w:r>
+        <w:rPr>
+          <w:rFonts w:ascii="Times New Roman" w:hAnsi="Times New Roman" w:eastAsia="Times New Roman" w:cs="Times New Roman"/>
+          <w:b w:val="0"/>
+          <w:i/>
+          <w:color w:val="000000"/>
+          <w:sz w:val="24"/>
+          <w:lang w:val="pt-BR"/>
+        </w:rPr>
+        <w:t>premium</w:t>
+      </w:r>
+      <w:r>
+        <w:rPr>
+          <w:rFonts w:ascii="Times New Roman" w:hAnsi="Times New Roman" w:eastAsia="Times New Roman" w:cs="Times New Roman"/>
+          <w:b w:val="0"/>
+          <w:i w:val="0"/>
+          <w:color w:val="000000"/>
+          <w:sz w:val="24"/>
+          <w:lang w:val="pt-BR"/>
+        </w:rPr>
+        <w:t xml:space="preserve">; por isso, esse conceito será tratado como uma construção operacional baseada em atributos observáveis e em critérios que deverão ser documentados e avaliados. Diante desse contexto, formula-se a seguinte questão de pesquisa: em que medida a integração entre conhecimento ontológico e representação </w:t>
+      </w:r>
+      <w:r>
+        <w:rPr>
+          <w:rFonts w:ascii="Times New Roman" w:hAnsi="Times New Roman" w:eastAsia="Times New Roman" w:cs="Times New Roman"/>
+          <w:b w:val="0"/>
+          <w:i/>
+          <w:color w:val="000000"/>
+          <w:sz w:val="24"/>
+          <w:lang w:val="pt-BR"/>
+        </w:rPr>
+        <w:t>fuzzy</w:t>
+      </w:r>
+      <w:r>
+        <w:rPr>
+          <w:rFonts w:ascii="Times New Roman" w:hAnsi="Times New Roman" w:eastAsia="Times New Roman" w:cs="Times New Roman"/>
+          <w:b w:val="0"/>
+          <w:i w:val="0"/>
+          <w:color w:val="000000"/>
+          <w:sz w:val="24"/>
+          <w:lang w:val="pt-BR"/>
+        </w:rPr>
+        <w:t xml:space="preserve"> de preferências pode apoiar recomendações personalizadas e explicáveis em cenários com diferentes níveis de informação sobre usuários e produtos?</w:t>
       </w:r>
     </w:p>
     <w:p>
       <w:pPr>
-        <w:spacing w:line="360" w:lineRule="auto" w:after="120"/>
+        <w:pStyle w:val="Heading2"/>
         <w:jc w:val="left"/>
       </w:pPr>
       <w:r>
         <w:rPr>
-          <w:rFonts w:ascii="Times New Roman" w:hAnsi="Times New Roman"/>
+          <w:rFonts w:ascii="Times New Roman" w:hAnsi="Times New Roman" w:eastAsia="Times New Roman" w:cs="Times New Roman"/>
           <w:b/>
-          <w:sz w:val="24"/>
+          <w:i w:val="0"/>
+          <w:color w:val="000000"/>
+          <w:sz w:val="22"/>
+          <w:lang w:val="pt-BR"/>
         </w:rPr>
-        <w:t>1.2 Justificativa e Motivação</w:t>
+        <w:t>1.2 JUSTIFICATIVA E MOTIVAÇÃO</w:t>
       </w:r>
     </w:p>
     <w:p>
       <w:pPr>
-        <w:spacing w:line="360" w:lineRule="auto" w:after="120"/>
         <w:ind w:firstLine="709"/>
         <w:jc w:val="both"/>
       </w:pPr>
       <w:r>
         <w:rPr>
-          <w:rFonts w:ascii="Times New Roman" w:hAnsi="Times New Roman"/>
+          <w:rFonts w:ascii="Times New Roman" w:hAnsi="Times New Roman" w:eastAsia="Times New Roman" w:cs="Times New Roman"/>
           <w:b w:val="0"/>
+          <w:i w:val="0"/>
+          <w:color w:val="000000"/>
           <w:sz w:val="24"/>
+          <w:lang w:val="pt-BR"/>
         </w:rPr>
-        <w:t>A justificativa deste trabalho está na limitação prática dos recomendadores tradicionais quando aplicados a catálogos especializados. A filtragem colaborativa funciona melhor quando há massa crítica de interações. Em e-commerce premium, essa massa crítica costuma ser irregular. Produtos caros recebem menos avaliações, usuários compram com menor frequência e a comparação entre itens envolve atributos subjetivos que não aparecem diretamente na matriz de ratings. O resultado é um risco técnico claro: o sistema pode privilegiar popularidade genérica em vez de compatibilidade real com o perfil do usuário. A literatura clássica já aponta que sistemas de recomendação precisam combinar diferentes fontes de informação quando uma única técnica não representa adequadamente o problema (ADOMAVICIUS; TUZHILIN, 2005; BURKE, 2002).</w:t>
+        <w:t>A justificativa deste trabalho está nas limitações dos recomendadores tradicionais quando as interações disponíveis são insuficientes ou quando atributos relevantes do domínio não estão representados na matriz usuário-item. A filtragem colaborativa utiliza relações observadas entre usuários e produtos, enquanto abordagens baseadas em conteúdo e conhecimento podem incorporar características dos itens. A combinação dessas fontes em um sistema híbrido permite investigar se informações complementares produzem recomendações mais adequadas ao problema estudado, sem pressupor ganho automático de desempenho (Adomavicius; Tuzhilin, 2005; Burke, 2002).</w:t>
       </w:r>
     </w:p>
     <w:p>
       <w:pPr>
-        <w:spacing w:line="360" w:lineRule="auto" w:after="120"/>
         <w:ind w:firstLine="709"/>
         <w:jc w:val="both"/>
       </w:pPr>
       <w:r>
         <w:rPr>
-          <w:rFonts w:ascii="Times New Roman" w:hAnsi="Times New Roman"/>
+          <w:rFonts w:ascii="Times New Roman" w:hAnsi="Times New Roman" w:eastAsia="Times New Roman" w:cs="Times New Roman"/>
           <w:b w:val="0"/>
+          <w:i w:val="0"/>
+          <w:color w:val="000000"/>
           <w:sz w:val="24"/>
+          <w:lang w:val="pt-BR"/>
         </w:rPr>
-        <w:t>Esse risco é mais relevante quando o produto recomendado possui alto valor financeiro. Uma recomendação inadequada de item simples pode gerar apenas baixo engajamento. Uma recomendação inadequada de produto premium pode comprometer a percepção de qualidade da plataforma. Nesse tipo de mercado, confiança e explicabilidade importam. O usuário precisa reconhecer algum sentido na recomendação: categoria compatível, ambiente de uso coerente, faixa de preço aceitável, avaliação positiva, material desejado ou proximidade com produtos anteriormente demonstrados como relevantes. A explicabilidade em sistemas de recomendação é tratada como fator relevante para transparência e aceitação das sugestões (ZHANG; CHEN, 2020).</w:t>
+        <w:t xml:space="preserve">No domínio de produtos residenciais </w:t>
+      </w:r>
+      <w:r>
+        <w:rPr>
+          <w:rFonts w:ascii="Times New Roman" w:hAnsi="Times New Roman" w:eastAsia="Times New Roman" w:cs="Times New Roman"/>
+          <w:b w:val="0"/>
+          <w:i/>
+          <w:color w:val="000000"/>
+          <w:sz w:val="24"/>
+          <w:lang w:val="pt-BR"/>
+        </w:rPr>
+        <w:t>premium</w:t>
+      </w:r>
+      <w:r>
+        <w:rPr>
+          <w:rFonts w:ascii="Times New Roman" w:hAnsi="Times New Roman" w:eastAsia="Times New Roman" w:cs="Times New Roman"/>
+          <w:b w:val="0"/>
+          <w:i w:val="0"/>
+          <w:color w:val="000000"/>
+          <w:sz w:val="24"/>
+          <w:lang w:val="pt-BR"/>
+        </w:rPr>
+        <w:t>, a proposta considera que a recomendação deve ser acompanhada por fatores compreensíveis, como categoria, ambiente de uso, faixa de preço, avaliação e atributos do produto. A explicabilidade é relevante porque permite apresentar ao usuário e ao pesquisador os elementos que contribuíram para uma sugestão, favorecendo a análise da transparência e da aceitação das recomendações (Zhang; Chen, 2020).</w:t>
       </w:r>
     </w:p>
     <w:p>
       <w:pPr>
-        <w:spacing w:line="360" w:lineRule="auto" w:after="120"/>
         <w:ind w:firstLine="709"/>
         <w:jc w:val="both"/>
       </w:pPr>
       <w:r>
         <w:rPr>
-          <w:rFonts w:ascii="Times New Roman" w:hAnsi="Times New Roman"/>
+          <w:rFonts w:ascii="Times New Roman" w:hAnsi="Times New Roman" w:eastAsia="Times New Roman" w:cs="Times New Roman"/>
           <w:b w:val="0"/>
+          <w:i w:val="0"/>
+          <w:color w:val="000000"/>
           <w:sz w:val="24"/>
+          <w:lang w:val="pt-BR"/>
         </w:rPr>
-        <w:t>A lógica fuzzy contribui justamente nesse ponto. Ela permite modelar a gradualidade da intenção de compra sem forçar fronteiras artificiais. Um produto pode ser parcialmente premium, não apenas premium ou não premium. Um usuário pode ter média afinidade por uma categoria e alta afinidade por determinado ambiente. A recomendação pode combinar esses graus e produzir um escore de compatibilidade mais expressivo do que uma regra rígida. A abordagem também permite controlar situações de risco. Se o produto possui preço premium e a confiança no perfil do usuário é baixa, a recomendação pode receber prioridade moderada, ainda que sua avaliação média seja alta. Esse tipo de raciocínio é coerente com o uso da lógica fuzzy em sistemas de recomendação (JAIN; GUPTA, 2018; KARTHIK; GANAPATHY, 2021).</w:t>
+        <w:t xml:space="preserve">A lógica </w:t>
+      </w:r>
+      <w:r>
+        <w:rPr>
+          <w:rFonts w:ascii="Times New Roman" w:hAnsi="Times New Roman" w:eastAsia="Times New Roman" w:cs="Times New Roman"/>
+          <w:b w:val="0"/>
+          <w:i/>
+          <w:color w:val="000000"/>
+          <w:sz w:val="24"/>
+          <w:lang w:val="pt-BR"/>
+        </w:rPr>
+        <w:t>fuzzy</w:t>
+      </w:r>
+      <w:r>
+        <w:rPr>
+          <w:rFonts w:ascii="Times New Roman" w:hAnsi="Times New Roman" w:eastAsia="Times New Roman" w:cs="Times New Roman"/>
+          <w:b w:val="0"/>
+          <w:i w:val="0"/>
+          <w:color w:val="000000"/>
+          <w:sz w:val="24"/>
+          <w:lang w:val="pt-BR"/>
+        </w:rPr>
+        <w:t xml:space="preserve"> contribui para esse objetivo ao representar gradualidade sem impor fronteiras rígidas. Um produto pode possuir diferentes graus de pertinência ao conceito </w:t>
+      </w:r>
+      <w:r>
+        <w:rPr>
+          <w:rFonts w:ascii="Times New Roman" w:hAnsi="Times New Roman" w:eastAsia="Times New Roman" w:cs="Times New Roman"/>
+          <w:b w:val="0"/>
+          <w:i/>
+          <w:color w:val="000000"/>
+          <w:sz w:val="24"/>
+          <w:lang w:val="pt-BR"/>
+        </w:rPr>
+        <w:t>premium</w:t>
+      </w:r>
+      <w:r>
+        <w:rPr>
+          <w:rFonts w:ascii="Times New Roman" w:hAnsi="Times New Roman" w:eastAsia="Times New Roman" w:cs="Times New Roman"/>
+          <w:b w:val="0"/>
+          <w:i w:val="0"/>
+          <w:color w:val="000000"/>
+          <w:sz w:val="24"/>
+          <w:lang w:val="pt-BR"/>
+        </w:rPr>
+        <w:t>, e um usuário pode apresentar níveis distintos de afinidade por categorias, ambientes ou faixas de preço. Regras linguísticas podem combinar esses graus e produzir escores rastreáveis, desde que as funções de pertinência e os critérios de inferência sejam definidos e documentados de forma explícita (Jain; Gupta, 2018; Karthik; Ganapathy, 2021).</w:t>
       </w:r>
     </w:p>
     <w:p>
       <w:pPr>
-        <w:spacing w:line="360" w:lineRule="auto" w:after="120"/>
         <w:ind w:firstLine="709"/>
         <w:jc w:val="both"/>
       </w:pPr>
       <w:r>
         <w:rPr>
-          <w:rFonts w:ascii="Times New Roman" w:hAnsi="Times New Roman"/>
+          <w:rFonts w:ascii="Times New Roman" w:hAnsi="Times New Roman" w:eastAsia="Times New Roman" w:cs="Times New Roman"/>
           <w:b w:val="0"/>
+          <w:i w:val="0"/>
+          <w:color w:val="000000"/>
           <w:sz w:val="24"/>
+          <w:lang w:val="pt-BR"/>
         </w:rPr>
-        <w:t>A ontologia agrega uma segunda camada de valor. Ela organiza o conhecimento de domínio e permite que o sistema utilize relações semânticas para compensar a falta de interações. Em cenários de cold start, essa característica é decisiva. Um usuário com apenas uma avaliação positiva em Coffee, Tea &amp; Espresso pode ainda receber recomendações relacionadas a cozinha gourmet, eletrodomésticos premium ou acessórios compatíveis, desde que a proximidade semântica esteja representada. O sistema deixa de depender exclusivamente de usuários semelhantes e passa a usar conhecimento estruturado sobre produtos, princípio associado a sistemas baseados em conhecimento e recomendação semântica (GUO et al., 2022; GUIA; SILVA; BERNARDINO, 2019).</w:t>
+        <w:t xml:space="preserve">A ontologia acrescenta uma estrutura semântica para organizar o domínio e relacionar produtos, categorias, atributos e preferências. Em cenários de </w:t>
+      </w:r>
+      <w:r>
+        <w:rPr>
+          <w:rFonts w:ascii="Times New Roman" w:hAnsi="Times New Roman" w:eastAsia="Times New Roman" w:cs="Times New Roman"/>
+          <w:b w:val="0"/>
+          <w:i/>
+          <w:color w:val="000000"/>
+          <w:sz w:val="24"/>
+          <w:lang w:val="pt-BR"/>
+        </w:rPr>
+        <w:t>cold start</w:t>
+      </w:r>
+      <w:r>
+        <w:rPr>
+          <w:rFonts w:ascii="Times New Roman" w:hAnsi="Times New Roman" w:eastAsia="Times New Roman" w:cs="Times New Roman"/>
+          <w:b w:val="0"/>
+          <w:i w:val="0"/>
+          <w:color w:val="000000"/>
+          <w:sz w:val="24"/>
+          <w:lang w:val="pt-BR"/>
+        </w:rPr>
+        <w:t xml:space="preserve">, essa estrutura pode fornecer informação adicional ao histórico de interações, sem ser tratada como solução garantida para o problema. A combinação entre ontologia, filtragem colaborativa e regras </w:t>
+      </w:r>
+      <w:r>
+        <w:rPr>
+          <w:rFonts w:ascii="Times New Roman" w:hAnsi="Times New Roman" w:eastAsia="Times New Roman" w:cs="Times New Roman"/>
+          <w:b w:val="0"/>
+          <w:i/>
+          <w:color w:val="000000"/>
+          <w:sz w:val="24"/>
+          <w:lang w:val="pt-BR"/>
+        </w:rPr>
+        <w:t>fuzzy</w:t>
+      </w:r>
+      <w:r>
+        <w:rPr>
+          <w:rFonts w:ascii="Times New Roman" w:hAnsi="Times New Roman" w:eastAsia="Times New Roman" w:cs="Times New Roman"/>
+          <w:b w:val="0"/>
+          <w:i w:val="0"/>
+          <w:color w:val="000000"/>
+          <w:sz w:val="24"/>
+          <w:lang w:val="pt-BR"/>
+        </w:rPr>
+        <w:t xml:space="preserve"> possui precedentes em estudos de recomendação para comércio eletrônico e constitui a hipótese técnica que será examinada neste trabalho (Guia; Silva; Bernardino, 2019; Karthik; Ganapathy, 2021).</w:t>
       </w:r>
     </w:p>
     <w:p>
       <w:pPr>
-        <w:spacing w:line="360" w:lineRule="auto" w:after="120"/>
         <w:ind w:firstLine="709"/>
         <w:jc w:val="both"/>
       </w:pPr>
       <w:r>
         <w:rPr>
-          <w:rFonts w:ascii="Times New Roman" w:hAnsi="Times New Roman"/>
+          <w:rFonts w:ascii="Times New Roman" w:hAnsi="Times New Roman" w:eastAsia="Times New Roman" w:cs="Times New Roman"/>
           <w:b w:val="0"/>
+          <w:i w:val="0"/>
+          <w:color w:val="000000"/>
           <w:sz w:val="24"/>
+          <w:lang w:val="pt-BR"/>
         </w:rPr>
-        <w:t>A escolha do Amazon Reviews 2023 - Home and Kitchen se justifica por oferecer uma base pública e ampla para simular um ambiente de varejo digital. A validação inicial do schema confirmou categorias próximas ao domínio de interesse, como Kitchen &amp; Dining, Dining &amp; Entertaining, Kitchen Utensils &amp; Gadgets, Storage &amp; Organization, Bath, Bathroom Accessories, Dinnerware &amp; Serveware e Glassware &amp; Drinkware, além de campos úteis como título, descrição, características, preço, avaliação média e número de avaliações. Esse recorte permite construir uma ponte metodológica entre uma base pública e o contexto de uma empresa de nicho, como a Kouzina Club, sem depender de dados proprietários sensíveis. O uso de dados públicos também favorece reprodutibilidade experimental, desde que o recorte, os filtros e os parâmetros sejam documentados (HOU et al., 2024).</w:t>
+        <w:t xml:space="preserve">A escolha do Amazon Reviews 2023 - </w:t>
+      </w:r>
+      <w:r>
+        <w:rPr>
+          <w:rFonts w:ascii="Times New Roman" w:hAnsi="Times New Roman" w:eastAsia="Times New Roman" w:cs="Times New Roman"/>
+          <w:b w:val="0"/>
+          <w:i/>
+          <w:color w:val="000000"/>
+          <w:sz w:val="24"/>
+          <w:lang w:val="pt-BR"/>
+        </w:rPr>
+        <w:t>Home and Kitchen</w:t>
+      </w:r>
+      <w:r>
+        <w:rPr>
+          <w:rFonts w:ascii="Times New Roman" w:hAnsi="Times New Roman" w:eastAsia="Times New Roman" w:cs="Times New Roman"/>
+          <w:b w:val="0"/>
+          <w:i w:val="0"/>
+          <w:color w:val="000000"/>
+          <w:sz w:val="24"/>
+          <w:lang w:val="pt-BR"/>
+        </w:rPr>
+        <w:t xml:space="preserve"> se justifica por oferecer dados públicos de avaliações e metadados de produtos próximos ao domínio investigado. A validação inicial do esquema confirmou campos como título, descrição, características, preço, avaliação média e número de avaliações, além de categorias relacionadas a cozinha, organização e banheiro. Esses campos apresentam limitações de cobertura e deverão ser tratados durante a preparação dos dados. O uso de uma base pública favorece a reprodutibilidade, desde que versão, filtros, parâmetros e critérios de recorte sejam registrados (Hou </w:t>
+      </w:r>
+      <w:r>
+        <w:rPr>
+          <w:rFonts w:ascii="Times New Roman" w:hAnsi="Times New Roman" w:eastAsia="Times New Roman" w:cs="Times New Roman"/>
+          <w:b w:val="0"/>
+          <w:i/>
+          <w:color w:val="000000"/>
+          <w:sz w:val="24"/>
+          <w:lang w:val="pt-BR"/>
+        </w:rPr>
+        <w:t>et al.</w:t>
+      </w:r>
+      <w:r>
+        <w:rPr>
+          <w:rFonts w:ascii="Times New Roman" w:hAnsi="Times New Roman" w:eastAsia="Times New Roman" w:cs="Times New Roman"/>
+          <w:b w:val="0"/>
+          <w:i w:val="0"/>
+          <w:color w:val="000000"/>
+          <w:sz w:val="24"/>
+          <w:lang w:val="pt-BR"/>
+        </w:rPr>
+        <w:t>, 2024).</w:t>
       </w:r>
     </w:p>
     <w:p>
       <w:pPr>
-        <w:spacing w:line="360" w:lineRule="auto" w:after="120"/>
         <w:ind w:firstLine="709"/>
         <w:jc w:val="both"/>
       </w:pPr>
       <w:r>
         <w:rPr>
-          <w:rFonts w:ascii="Times New Roman" w:hAnsi="Times New Roman"/>
+          <w:rFonts w:ascii="Times New Roman" w:hAnsi="Times New Roman" w:eastAsia="Times New Roman" w:cs="Times New Roman"/>
           <w:b w:val="0"/>
+          <w:i w:val="0"/>
+          <w:color w:val="000000"/>
           <w:sz w:val="24"/>
+          <w:lang w:val="pt-BR"/>
         </w:rPr>
-        <w:t>A motivação acadêmica também é direta. A literatura sobre sistemas de recomendação registra limitações recorrentes associadas a cold start, esparsidade, baixa interpretabilidade e dificuldade de representar preferências graduais (YUAN; HERNANDEZ, 2023; ZHANG; CHEN, 2020). Trabalhos sobre ontologias fuzzy e recomendação baseada em conhecimento indicam caminhos promissores, mas ainda há espaço para investigar uma solução aplicada a e-commerce especializado em produtos premium para casa, cozinha, área gourmet e banheiro (KARTHIK; GANAPATHY, 2021; GUIA; SILVA; BERNARDINO, 2019). O trabalho busca ocupar esse espaço com um protótipo avaliável, documentado e comparável a baselines simples.</w:t>
+        <w:t xml:space="preserve">A motivação acadêmica consiste em avaliar, de forma controlada, como conhecimento semântico e preferências graduais podem ser combinados em um protótipo de recomendação. A literatura registra desafios associados a </w:t>
+      </w:r>
+      <w:r>
+        <w:rPr>
+          <w:rFonts w:ascii="Times New Roman" w:hAnsi="Times New Roman" w:eastAsia="Times New Roman" w:cs="Times New Roman"/>
+          <w:b w:val="0"/>
+          <w:i/>
+          <w:color w:val="000000"/>
+          <w:sz w:val="24"/>
+          <w:lang w:val="pt-BR"/>
+        </w:rPr>
+        <w:t>cold start</w:t>
+      </w:r>
+      <w:r>
+        <w:rPr>
+          <w:rFonts w:ascii="Times New Roman" w:hAnsi="Times New Roman" w:eastAsia="Times New Roman" w:cs="Times New Roman"/>
+          <w:b w:val="0"/>
+          <w:i w:val="0"/>
+          <w:color w:val="000000"/>
+          <w:sz w:val="24"/>
+          <w:lang w:val="pt-BR"/>
+        </w:rPr>
+        <w:t xml:space="preserve">, esparsidade e explicabilidade, enquanto trabalhos aplicados mostram diferentes formas de integrar ontologias e lógica </w:t>
+      </w:r>
+      <w:r>
+        <w:rPr>
+          <w:rFonts w:ascii="Times New Roman" w:hAnsi="Times New Roman" w:eastAsia="Times New Roman" w:cs="Times New Roman"/>
+          <w:b w:val="0"/>
+          <w:i/>
+          <w:color w:val="000000"/>
+          <w:sz w:val="24"/>
+          <w:lang w:val="pt-BR"/>
+        </w:rPr>
+        <w:t>fuzzy</w:t>
+      </w:r>
+      <w:r>
+        <w:rPr>
+          <w:rFonts w:ascii="Times New Roman" w:hAnsi="Times New Roman" w:eastAsia="Times New Roman" w:cs="Times New Roman"/>
+          <w:b w:val="0"/>
+          <w:i w:val="0"/>
+          <w:color w:val="000000"/>
+          <w:sz w:val="24"/>
+          <w:lang w:val="pt-BR"/>
+        </w:rPr>
+        <w:t xml:space="preserve"> (Yuan; Hernandez, 2023; Zhang; Chen, 2020; Guia; Silva; Bernardino, 2019; Karthik; Ganapathy, 2021). Assim, o trabalho delimita como espaço de investigação a aplicação dessa integração a produtos residenciais </w:t>
+      </w:r>
+      <w:r>
+        <w:rPr>
+          <w:rFonts w:ascii="Times New Roman" w:hAnsi="Times New Roman" w:eastAsia="Times New Roman" w:cs="Times New Roman"/>
+          <w:b w:val="0"/>
+          <w:i/>
+          <w:color w:val="000000"/>
+          <w:sz w:val="24"/>
+          <w:lang w:val="pt-BR"/>
+        </w:rPr>
+        <w:t>premium</w:t>
+      </w:r>
+      <w:r>
+        <w:rPr>
+          <w:rFonts w:ascii="Times New Roman" w:hAnsi="Times New Roman" w:eastAsia="Times New Roman" w:cs="Times New Roman"/>
+          <w:b w:val="0"/>
+          <w:i w:val="0"/>
+          <w:color w:val="000000"/>
+          <w:sz w:val="24"/>
+          <w:lang w:val="pt-BR"/>
+        </w:rPr>
+        <w:t>, com comparação experimental frente a métodos de referência.</w:t>
       </w:r>
     </w:p>
     <w:p>
       <w:pPr>
-        <w:spacing w:line="360" w:lineRule="auto" w:after="120"/>
+        <w:pStyle w:val="Heading2"/>
         <w:jc w:val="left"/>
       </w:pPr>
       <w:r>
         <w:rPr>
-          <w:rFonts w:ascii="Times New Roman" w:hAnsi="Times New Roman"/>
+          <w:rFonts w:ascii="Times New Roman" w:hAnsi="Times New Roman" w:eastAsia="Times New Roman" w:cs="Times New Roman"/>
           <w:b/>
-          <w:sz w:val="24"/>
+          <w:i w:val="0"/>
+          <w:color w:val="000000"/>
+          <w:sz w:val="22"/>
+          <w:lang w:val="pt-BR"/>
         </w:rPr>
-        <w:t>1.3 Objetivos (Geral e Específicos)</w:t>
+        <w:t>1.3 OBJETIVOS GERAL E ESPECÍFICOS</w:t>
       </w:r>
     </w:p>
     <w:p>
       <w:pPr>
-        <w:spacing w:line="360" w:lineRule="auto" w:after="120"/>
         <w:ind w:firstLine="709"/>
         <w:jc w:val="both"/>
       </w:pPr>
       <w:r>
         <w:rPr>
-          <w:rFonts w:ascii="Times New Roman" w:hAnsi="Times New Roman"/>
+          <w:rFonts w:ascii="Times New Roman" w:hAnsi="Times New Roman" w:eastAsia="Times New Roman" w:cs="Times New Roman"/>
           <w:b w:val="0"/>
+          <w:i w:val="0"/>
+          <w:color w:val="000000"/>
           <w:sz w:val="24"/>
+          <w:lang w:val="pt-BR"/>
         </w:rPr>
-        <w:t>O objetivo geral deste trabalho é desenvolver e avaliar um sistema de recomendação híbrido baseado em ontologias fuzzy, capaz de modelar preferências graduais de usuários e gerar recomendações personalizadas em um contexto de comércio eletrônico voltado a produtos residenciais premium. A caracterização do sistema como híbrido decorre da combinação entre conhecimento de domínio, regras fuzzy, perfis de usuário e técnicas de ranking, alinhando-se à noção de integração de métodos em sistemas recomendadores (BURKE, 2002).</w:t>
+        <w:t xml:space="preserve">O objetivo geral deste trabalho é desenvolver e avaliar um sistema de recomendação híbrido baseado na integração entre ontologias e lógica </w:t>
+      </w:r>
+      <w:r>
+        <w:rPr>
+          <w:rFonts w:ascii="Times New Roman" w:hAnsi="Times New Roman" w:eastAsia="Times New Roman" w:cs="Times New Roman"/>
+          <w:b w:val="0"/>
+          <w:i/>
+          <w:color w:val="000000"/>
+          <w:sz w:val="24"/>
+          <w:lang w:val="pt-BR"/>
+        </w:rPr>
+        <w:t>fuzzy</w:t>
+      </w:r>
+      <w:r>
+        <w:rPr>
+          <w:rFonts w:ascii="Times New Roman" w:hAnsi="Times New Roman" w:eastAsia="Times New Roman" w:cs="Times New Roman"/>
+          <w:b w:val="0"/>
+          <w:i w:val="0"/>
+          <w:color w:val="000000"/>
+          <w:sz w:val="24"/>
+          <w:lang w:val="pt-BR"/>
+        </w:rPr>
+        <w:t xml:space="preserve">, capaz de modelar preferências graduais de usuários e gerar recomendações personalizadas e explicáveis para produtos residenciais </w:t>
+      </w:r>
+      <w:r>
+        <w:rPr>
+          <w:rFonts w:ascii="Times New Roman" w:hAnsi="Times New Roman" w:eastAsia="Times New Roman" w:cs="Times New Roman"/>
+          <w:b w:val="0"/>
+          <w:i/>
+          <w:color w:val="000000"/>
+          <w:sz w:val="24"/>
+          <w:lang w:val="pt-BR"/>
+        </w:rPr>
+        <w:t>premium</w:t>
+      </w:r>
+      <w:r>
+        <w:rPr>
+          <w:rFonts w:ascii="Times New Roman" w:hAnsi="Times New Roman" w:eastAsia="Times New Roman" w:cs="Times New Roman"/>
+          <w:b w:val="0"/>
+          <w:i w:val="0"/>
+          <w:color w:val="000000"/>
+          <w:sz w:val="24"/>
+          <w:lang w:val="pt-BR"/>
+        </w:rPr>
+        <w:t xml:space="preserve"> em comércio eletrônico.</w:t>
       </w:r>
     </w:p>
     <w:p>
       <w:pPr>
-        <w:spacing w:line="360" w:lineRule="auto" w:after="120"/>
         <w:ind w:firstLine="709"/>
         <w:jc w:val="both"/>
       </w:pPr>
       <w:r>
         <w:rPr>
-          <w:rFonts w:ascii="Times New Roman" w:hAnsi="Times New Roman"/>
+          <w:rFonts w:ascii="Times New Roman" w:hAnsi="Times New Roman" w:eastAsia="Times New Roman" w:cs="Times New Roman"/>
           <w:b w:val="0"/>
+          <w:i w:val="0"/>
+          <w:color w:val="000000"/>
           <w:sz w:val="24"/>
+          <w:lang w:val="pt-BR"/>
         </w:rPr>
-        <w:t>Para alcançar esse objetivo, são definidos os seguintes objetivos específicos:</w:t>
+        <w:t>Para alcançar esse objetivo geral, são definidos quatro objetivos específicos:</w:t>
       </w:r>
     </w:p>
     <w:p>
       <w:pPr>
-        <w:spacing w:line="360" w:lineRule="auto" w:after="120"/>
-        <w:ind w:left="709"/>
+        <w:numPr>
+          <w:ilvl w:val="0"/>
+          <w:numId w:val="10"/>
+        </w:numPr>
         <w:jc w:val="both"/>
       </w:pPr>
       <w:r>
         <w:rPr>
-          <w:rFonts w:ascii="Times New Roman" w:hAnsi="Times New Roman"/>
+          <w:rFonts w:ascii="Times New Roman" w:hAnsi="Times New Roman" w:eastAsia="Times New Roman" w:cs="Times New Roman"/>
           <w:b w:val="0"/>
+          <w:i w:val="0"/>
+          <w:color w:val="000000"/>
           <w:sz w:val="24"/>
+          <w:lang w:val="pt-BR"/>
         </w:rPr>
-        <w:t>a) investigar os fundamentos de sistemas de recomendação, filtragem colaborativa, recomendação baseada em conteúdo, lógica fuzzy, ontologias de domínio e estratégias para mitigação de cold start (ADOMAVICIUS; TUZHILIN, 2005; JAIN; GUPTA, 2018; YUAN; HERNANDEZ, 2023);</w:t>
+        <w:t xml:space="preserve">analisar os fundamentos de sistemas de recomendação, lógica </w:t>
+      </w:r>
+      <w:r>
+        <w:rPr>
+          <w:rFonts w:ascii="Times New Roman" w:hAnsi="Times New Roman" w:eastAsia="Times New Roman" w:cs="Times New Roman"/>
+          <w:b w:val="0"/>
+          <w:i/>
+          <w:color w:val="000000"/>
+          <w:sz w:val="24"/>
+          <w:lang w:val="pt-BR"/>
+        </w:rPr>
+        <w:t>fuzzy</w:t>
+      </w:r>
+      <w:r>
+        <w:rPr>
+          <w:rFonts w:ascii="Times New Roman" w:hAnsi="Times New Roman" w:eastAsia="Times New Roman" w:cs="Times New Roman"/>
+          <w:b w:val="0"/>
+          <w:i w:val="0"/>
+          <w:color w:val="000000"/>
+          <w:sz w:val="24"/>
+          <w:lang w:val="pt-BR"/>
+        </w:rPr>
+        <w:t xml:space="preserve">, ontologias, explicabilidade e estratégias relacionadas ao problema de </w:t>
+      </w:r>
+      <w:r>
+        <w:rPr>
+          <w:rFonts w:ascii="Times New Roman" w:hAnsi="Times New Roman" w:eastAsia="Times New Roman" w:cs="Times New Roman"/>
+          <w:b w:val="0"/>
+          <w:i/>
+          <w:color w:val="000000"/>
+          <w:sz w:val="24"/>
+          <w:lang w:val="pt-BR"/>
+        </w:rPr>
+        <w:t>cold start</w:t>
+      </w:r>
+      <w:r>
+        <w:rPr>
+          <w:rFonts w:ascii="Times New Roman" w:hAnsi="Times New Roman" w:eastAsia="Times New Roman" w:cs="Times New Roman"/>
+          <w:b w:val="0"/>
+          <w:i w:val="0"/>
+          <w:color w:val="000000"/>
+          <w:sz w:val="24"/>
+          <w:lang w:val="pt-BR"/>
+        </w:rPr>
+        <w:t>;</w:t>
       </w:r>
     </w:p>
     <w:p>
       <w:pPr>
-        <w:spacing w:line="360" w:lineRule="auto" w:after="120"/>
-        <w:ind w:left="709"/>
+        <w:numPr>
+          <w:ilvl w:val="0"/>
+          <w:numId w:val="10"/>
+        </w:numPr>
         <w:jc w:val="both"/>
       </w:pPr>
       <w:r>
         <w:rPr>
-          <w:rFonts w:ascii="Times New Roman" w:hAnsi="Times New Roman"/>
+          <w:rFonts w:ascii="Times New Roman" w:hAnsi="Times New Roman" w:eastAsia="Times New Roman" w:cs="Times New Roman"/>
           <w:b w:val="0"/>
+          <w:i w:val="0"/>
+          <w:color w:val="000000"/>
           <w:sz w:val="24"/>
+          <w:lang w:val="pt-BR"/>
         </w:rPr>
-        <w:t>b) selecionar e preparar um recorte do dataset Amazon Reviews 2023 - Home and Kitchen compatível com produtos de cozinha, área gourmet, eletrodomésticos, utensílios premium, decoração funcional e banheiro (HOU et al., 2024);</w:t>
+        <w:t xml:space="preserve">selecionar, validar e preparar um recorte do Amazon Reviews 2023 - </w:t>
+      </w:r>
+      <w:r>
+        <w:rPr>
+          <w:rFonts w:ascii="Times New Roman" w:hAnsi="Times New Roman" w:eastAsia="Times New Roman" w:cs="Times New Roman"/>
+          <w:b w:val="0"/>
+          <w:i/>
+          <w:color w:val="000000"/>
+          <w:sz w:val="24"/>
+          <w:lang w:val="pt-BR"/>
+        </w:rPr>
+        <w:t>Home and Kitchen</w:t>
+      </w:r>
+      <w:r>
+        <w:rPr>
+          <w:rFonts w:ascii="Times New Roman" w:hAnsi="Times New Roman" w:eastAsia="Times New Roman" w:cs="Times New Roman"/>
+          <w:b w:val="0"/>
+          <w:i w:val="0"/>
+          <w:color w:val="000000"/>
+          <w:sz w:val="24"/>
+          <w:lang w:val="pt-BR"/>
+        </w:rPr>
+        <w:t xml:space="preserve">, incluindo a definição operacional e rastreável do conceito de produto </w:t>
+      </w:r>
+      <w:r>
+        <w:rPr>
+          <w:rFonts w:ascii="Times New Roman" w:hAnsi="Times New Roman" w:eastAsia="Times New Roman" w:cs="Times New Roman"/>
+          <w:b w:val="0"/>
+          <w:i/>
+          <w:color w:val="000000"/>
+          <w:sz w:val="24"/>
+          <w:lang w:val="pt-BR"/>
+        </w:rPr>
+        <w:t>premium</w:t>
+      </w:r>
+      <w:r>
+        <w:rPr>
+          <w:rFonts w:ascii="Times New Roman" w:hAnsi="Times New Roman" w:eastAsia="Times New Roman" w:cs="Times New Roman"/>
+          <w:b w:val="0"/>
+          <w:i w:val="0"/>
+          <w:color w:val="000000"/>
+          <w:sz w:val="24"/>
+          <w:lang w:val="pt-BR"/>
+        </w:rPr>
+        <w:t>;</w:t>
       </w:r>
     </w:p>
     <w:p>
       <w:pPr>
-        <w:spacing w:line="360" w:lineRule="auto" w:after="120"/>
-        <w:ind w:left="709"/>
+        <w:numPr>
+          <w:ilvl w:val="0"/>
+          <w:numId w:val="10"/>
+        </w:numPr>
         <w:jc w:val="both"/>
       </w:pPr>
       <w:r>
         <w:rPr>
-          <w:rFonts w:ascii="Times New Roman" w:hAnsi="Times New Roman"/>
+          <w:rFonts w:ascii="Times New Roman" w:hAnsi="Times New Roman" w:eastAsia="Times New Roman" w:cs="Times New Roman"/>
           <w:b w:val="0"/>
+          <w:i w:val="0"/>
+          <w:color w:val="000000"/>
           <w:sz w:val="24"/>
+          <w:lang w:val="pt-BR"/>
         </w:rPr>
-        <w:t>c) definir uma representação operacional para produto premium/luxo, baseada em critérios observáveis como preço relativo, avaliação, popularidade, marca, categoria, materiais e atributos textuais;</w:t>
+        <w:t xml:space="preserve">modelar a representação ontológica do domínio, os perfis graduais de usuário e as regras </w:t>
+      </w:r>
+      <w:r>
+        <w:rPr>
+          <w:rFonts w:ascii="Times New Roman" w:hAnsi="Times New Roman" w:eastAsia="Times New Roman" w:cs="Times New Roman"/>
+          <w:b w:val="0"/>
+          <w:i/>
+          <w:color w:val="000000"/>
+          <w:sz w:val="24"/>
+          <w:lang w:val="pt-BR"/>
+        </w:rPr>
+        <w:t>fuzzy</w:t>
+      </w:r>
+      <w:r>
+        <w:rPr>
+          <w:rFonts w:ascii="Times New Roman" w:hAnsi="Times New Roman" w:eastAsia="Times New Roman" w:cs="Times New Roman"/>
+          <w:b w:val="0"/>
+          <w:i w:val="0"/>
+          <w:color w:val="000000"/>
+          <w:sz w:val="24"/>
+          <w:lang w:val="pt-BR"/>
+        </w:rPr>
+        <w:t>, integrando esses elementos em um protótipo que gere listas de recomendação e justificativas associadas;</w:t>
       </w:r>
     </w:p>
     <w:p>
       <w:pPr>
-        <w:spacing w:line="360" w:lineRule="auto" w:after="120"/>
-        <w:ind w:left="709"/>
+        <w:numPr>
+          <w:ilvl w:val="0"/>
+          <w:numId w:val="10"/>
+        </w:numPr>
         <w:jc w:val="both"/>
       </w:pPr>
       <w:r>
         <w:rPr>
-          <w:rFonts w:ascii="Times New Roman" w:hAnsi="Times New Roman"/>
+          <w:rFonts w:ascii="Times New Roman" w:hAnsi="Times New Roman" w:eastAsia="Times New Roman" w:cs="Times New Roman"/>
           <w:b w:val="0"/>
+          <w:i w:val="0"/>
+          <w:color w:val="000000"/>
           <w:sz w:val="24"/>
+          <w:lang w:val="pt-BR"/>
         </w:rPr>
-        <w:t>d) modelar uma ontologia inicial de produtos, contemplando entidades como usuário, produto, categoria, ambiente, marca, faixa de preço, avaliação, atributo, material, estilo, função, preferência e recomendação (GUIA; SILVA; BERNARDINO, 2019);</w:t>
+        <w:t xml:space="preserve">avaliar o modelo proposto com o mesmo protocolo experimental aplicado aos métodos de referência, utilizando métricas de recomendação Top-N e cenários gerais e de </w:t>
+      </w:r>
+      <w:r>
+        <w:rPr>
+          <w:rFonts w:ascii="Times New Roman" w:hAnsi="Times New Roman" w:eastAsia="Times New Roman" w:cs="Times New Roman"/>
+          <w:b w:val="0"/>
+          <w:i/>
+          <w:color w:val="000000"/>
+          <w:sz w:val="24"/>
+          <w:lang w:val="pt-BR"/>
+        </w:rPr>
+        <w:t>cold start</w:t>
+      </w:r>
+      <w:r>
+        <w:rPr>
+          <w:rFonts w:ascii="Times New Roman" w:hAnsi="Times New Roman" w:eastAsia="Times New Roman" w:cs="Times New Roman"/>
+          <w:b w:val="0"/>
+          <w:i w:val="0"/>
+          <w:color w:val="000000"/>
+          <w:sz w:val="24"/>
+          <w:lang w:val="pt-BR"/>
+        </w:rPr>
+        <w:t>.</w:t>
       </w:r>
     </w:p>
     <w:p>
       <w:pPr>
-        <w:spacing w:line="360" w:lineRule="auto" w:after="120"/>
-        <w:ind w:left="709"/>
-        <w:jc w:val="both"/>
+        <w:pStyle w:val="Heading2"/>
+        <w:jc w:val="left"/>
       </w:pPr>
       <w:r>
         <w:rPr>
-          <w:rFonts w:ascii="Times New Roman" w:hAnsi="Times New Roman"/>
-          <w:b w:val="0"/>
-          <w:sz w:val="24"/>
+          <w:rFonts w:ascii="Times New Roman" w:hAnsi="Times New Roman" w:eastAsia="Times New Roman" w:cs="Times New Roman"/>
+          <w:b/>
+          <w:i w:val="0"/>
+          <w:color w:val="000000"/>
+          <w:sz w:val="22"/>
+          <w:lang w:val="pt-BR"/>
         </w:rPr>
-        <w:t>e) construir perfis fuzzy de usuários a partir de interações positivas, negativas ou neutras, considerando afinidade por categoria, ambiente, marca, faixa de preço, popularidade e compatibilidade com produtos premium (KARTHIK; GANAPATHY, 2021);</w:t>
+        <w:t>1.4 SÍNTESE DA METODOLOGIA</w:t>
       </w:r>
     </w:p>
     <w:p>
       <w:pPr>
-        <w:spacing w:line="360" w:lineRule="auto" w:after="120"/>
-        <w:ind w:left="709"/>
-        <w:jc w:val="both"/>
-      </w:pPr>
-      <w:r>
-        <w:rPr>
-          <w:rFonts w:ascii="Times New Roman" w:hAnsi="Times New Roman"/>
-          <w:b w:val="0"/>
-          <w:sz w:val="24"/>
-        </w:rPr>
-        <w:t>f) implementar um motor de inferência fuzzy para calcular escores de compatibilidade entre usuários e produtos candidatos (JAIN; GUPTA, 2018);</w:t>
-      </w:r>
-    </w:p>
-    <w:p>
-      <w:pPr>
-        <w:spacing w:line="360" w:lineRule="auto" w:after="120"/>
-        <w:ind w:left="709"/>
-        <w:jc w:val="both"/>
-      </w:pPr>
-      <w:r>
-        <w:rPr>
-          <w:rFonts w:ascii="Times New Roman" w:hAnsi="Times New Roman"/>
-          <w:b w:val="0"/>
-          <w:sz w:val="24"/>
-        </w:rPr>
-        <w:t>g) gerar rankings Top-N acompanhados de explicações textuais, indicando os fatores que contribuíram para cada recomendação (ZHANG; CHEN, 2020);</w:t>
-      </w:r>
-    </w:p>
-    <w:p>
-      <w:pPr>
-        <w:spacing w:line="360" w:lineRule="auto" w:after="120"/>
-        <w:ind w:left="709"/>
-        <w:jc w:val="both"/>
-      </w:pPr>
-      <w:r>
-        <w:rPr>
-          <w:rFonts w:ascii="Times New Roman" w:hAnsi="Times New Roman"/>
-          <w:b w:val="0"/>
-          <w:sz w:val="24"/>
-        </w:rPr>
-        <w:t>h) comparar o modelo proposto com baselines como popularidade, recomendação por categoria preferida, abordagem content-based simples e, se o escopo permitir, filtragem colaborativa (ISINKAYE; FOLAJIMI; OJOKOH, 2015);</w:t>
-      </w:r>
-    </w:p>
-    <w:p>
-      <w:pPr>
-        <w:spacing w:line="360" w:lineRule="auto" w:after="120"/>
-        <w:ind w:left="709"/>
-        <w:jc w:val="both"/>
-      </w:pPr>
-      <w:r>
-        <w:rPr>
-          <w:rFonts w:ascii="Times New Roman" w:hAnsi="Times New Roman"/>
-          <w:b w:val="0"/>
-          <w:sz w:val="24"/>
-        </w:rPr>
-        <w:t>i) avaliar os resultados por métricas adequadas a recomendação Top-N, como Precision@K, Recall@K, NDCG@K, Hit Rate@K e Coverage, incluindo cenários gerais e cenários de cold start (YUAN; HERNANDEZ, 2023).</w:t>
-      </w:r>
-    </w:p>
-    <w:p>
-      <w:pPr>
-        <w:spacing w:line="360" w:lineRule="auto" w:after="120"/>
-        <w:jc w:val="left"/>
-      </w:pPr>
-      <w:r>
-        <w:rPr>
-          <w:rFonts w:ascii="Times New Roman" w:hAnsi="Times New Roman"/>
-          <w:b/>
-          <w:sz w:val="24"/>
-        </w:rPr>
-        <w:t>1.4 Organização da monografia</w:t>
-      </w:r>
-    </w:p>
-    <w:p>
-      <w:pPr>
-        <w:spacing w:line="360" w:lineRule="auto" w:after="120"/>
         <w:ind w:firstLine="709"/>
         <w:jc w:val="both"/>
       </w:pPr>
       <w:r>
         <w:rPr>
-          <w:rFonts w:ascii="Times New Roman" w:hAnsi="Times New Roman"/>
+          <w:rFonts w:ascii="Times New Roman" w:hAnsi="Times New Roman" w:eastAsia="Times New Roman" w:cs="Times New Roman"/>
           <w:b w:val="0"/>
+          <w:i w:val="0"/>
+          <w:color w:val="000000"/>
           <w:sz w:val="24"/>
+          <w:lang w:val="pt-BR"/>
         </w:rPr>
-        <w:t>Esta monografia está organizada em sete capítulos. O primeiro capítulo apresenta a introdução, com a contextualização do problema, a justificativa, a motivação, os objetivos e a estrutura geral do trabalho.</w:t>
+        <w:t xml:space="preserve">A investigação será desenvolvida em quatro etapas. A primeira corresponde à revisão bibliográfica dos conceitos e trabalhos relacionados. A segunda abrange a validação do esquema, a limpeza e o recorte do Amazon Reviews 2023 - </w:t>
+      </w:r>
+      <w:r>
+        <w:rPr>
+          <w:rFonts w:ascii="Times New Roman" w:hAnsi="Times New Roman" w:eastAsia="Times New Roman" w:cs="Times New Roman"/>
+          <w:b w:val="0"/>
+          <w:i/>
+          <w:color w:val="000000"/>
+          <w:sz w:val="24"/>
+          <w:lang w:val="pt-BR"/>
+        </w:rPr>
+        <w:t>Home and Kitchen</w:t>
+      </w:r>
+      <w:r>
+        <w:rPr>
+          <w:rFonts w:ascii="Times New Roman" w:hAnsi="Times New Roman" w:eastAsia="Times New Roman" w:cs="Times New Roman"/>
+          <w:b w:val="0"/>
+          <w:i w:val="0"/>
+          <w:color w:val="000000"/>
+          <w:sz w:val="24"/>
+          <w:lang w:val="pt-BR"/>
+        </w:rPr>
+        <w:t xml:space="preserve">, sem assumir a existência de um rótulo nativo de produto </w:t>
+      </w:r>
+      <w:r>
+        <w:rPr>
+          <w:rFonts w:ascii="Times New Roman" w:hAnsi="Times New Roman" w:eastAsia="Times New Roman" w:cs="Times New Roman"/>
+          <w:b w:val="0"/>
+          <w:i/>
+          <w:color w:val="000000"/>
+          <w:sz w:val="24"/>
+          <w:lang w:val="pt-BR"/>
+        </w:rPr>
+        <w:t>premium</w:t>
+      </w:r>
+      <w:r>
+        <w:rPr>
+          <w:rFonts w:ascii="Times New Roman" w:hAnsi="Times New Roman" w:eastAsia="Times New Roman" w:cs="Times New Roman"/>
+          <w:b w:val="0"/>
+          <w:i w:val="0"/>
+          <w:color w:val="000000"/>
+          <w:sz w:val="24"/>
+          <w:lang w:val="pt-BR"/>
+        </w:rPr>
+        <w:t xml:space="preserve">. A terceira compreende a modelagem da ontologia, das variáveis linguísticas, das funções de pertinência e das regras </w:t>
+      </w:r>
+      <w:r>
+        <w:rPr>
+          <w:rFonts w:ascii="Times New Roman" w:hAnsi="Times New Roman" w:eastAsia="Times New Roman" w:cs="Times New Roman"/>
+          <w:b w:val="0"/>
+          <w:i/>
+          <w:color w:val="000000"/>
+          <w:sz w:val="24"/>
+          <w:lang w:val="pt-BR"/>
+        </w:rPr>
+        <w:t>fuzzy</w:t>
+      </w:r>
+      <w:r>
+        <w:rPr>
+          <w:rFonts w:ascii="Times New Roman" w:hAnsi="Times New Roman" w:eastAsia="Times New Roman" w:cs="Times New Roman"/>
+          <w:b w:val="0"/>
+          <w:i w:val="0"/>
+          <w:color w:val="000000"/>
+          <w:sz w:val="24"/>
+          <w:lang w:val="pt-BR"/>
+        </w:rPr>
+        <w:t>, seguida pelo desenvolvimento do protótipo. A quarta etapa consiste na avaliação experimental do modelo e dos métodos de referência sob os mesmos conjuntos de treino e teste.</w:t>
       </w:r>
     </w:p>
     <w:p>
       <w:pPr>
-        <w:spacing w:line="360" w:lineRule="auto" w:after="120"/>
         <w:ind w:firstLine="709"/>
         <w:jc w:val="both"/>
       </w:pPr>
       <w:r>
         <w:rPr>
-          <w:rFonts w:ascii="Times New Roman" w:hAnsi="Times New Roman"/>
+          <w:rFonts w:ascii="Times New Roman" w:hAnsi="Times New Roman" w:eastAsia="Times New Roman" w:cs="Times New Roman"/>
           <w:b w:val="0"/>
+          <w:i w:val="0"/>
+          <w:color w:val="000000"/>
           <w:sz w:val="24"/>
+          <w:lang w:val="pt-BR"/>
         </w:rPr>
-        <w:t>O segundo capítulo aborda a fundamentação teórica. Serão discutidos os conceitos de sistemas de recomendação em comércio eletrônico, filtragem colaborativa, recomendação baseada em conteúdo, lógica fuzzy, teoria dos conjuntos fuzzy, ontologias, representação semântica e arquiteturas de aplicação. Essa base conceitual sustenta a escolha por uma abordagem híbrida, interpretável e orientada por conhecimento de domínio.</w:t>
+        <w:t xml:space="preserve">Os experimentos deverão registrar versão dos dados, filtros, parâmetros, métricas e sementes. A avaliação considerará listas Top-N, cenários de </w:t>
+      </w:r>
+      <w:r>
+        <w:rPr>
+          <w:rFonts w:ascii="Times New Roman" w:hAnsi="Times New Roman" w:eastAsia="Times New Roman" w:cs="Times New Roman"/>
+          <w:b w:val="0"/>
+          <w:i/>
+          <w:color w:val="000000"/>
+          <w:sz w:val="24"/>
+          <w:lang w:val="pt-BR"/>
+        </w:rPr>
+        <w:t>cold start</w:t>
+      </w:r>
+      <w:r>
+        <w:rPr>
+          <w:rFonts w:ascii="Times New Roman" w:hAnsi="Times New Roman" w:eastAsia="Times New Roman" w:cs="Times New Roman"/>
+          <w:b w:val="0"/>
+          <w:i w:val="0"/>
+          <w:color w:val="000000"/>
+          <w:sz w:val="24"/>
+          <w:lang w:val="pt-BR"/>
+        </w:rPr>
+        <w:t>, cobertura e análise das justificativas produzidas. As decisões metodológicas serão documentadas antes ou junto da implementação para manter a rastreabilidade entre os objetivos, os dados, as regras de inferência e os resultados.</w:t>
       </w:r>
     </w:p>
     <w:p>
       <w:pPr>
-        <w:spacing w:line="360" w:lineRule="auto" w:after="120"/>
+        <w:pStyle w:val="Heading2"/>
+        <w:jc w:val="left"/>
+      </w:pPr>
+      <w:r>
+        <w:rPr>
+          <w:rFonts w:ascii="Times New Roman" w:hAnsi="Times New Roman" w:eastAsia="Times New Roman" w:cs="Times New Roman"/>
+          <w:b/>
+          <w:i w:val="0"/>
+          <w:color w:val="000000"/>
+          <w:sz w:val="22"/>
+          <w:lang w:val="pt-BR"/>
+        </w:rPr>
+        <w:t>1.5 ORGANIZAÇÃO DA MONOGRAFIA</w:t>
+      </w:r>
+    </w:p>
+    <w:p>
+      <w:pPr>
         <w:ind w:firstLine="709"/>
         <w:jc w:val="both"/>
       </w:pPr>
       <w:r>
         <w:rPr>
-          <w:rFonts w:ascii="Times New Roman" w:hAnsi="Times New Roman"/>
+          <w:rFonts w:ascii="Times New Roman" w:hAnsi="Times New Roman" w:eastAsia="Times New Roman" w:cs="Times New Roman"/>
           <w:b w:val="0"/>
+          <w:i w:val="0"/>
+          <w:color w:val="000000"/>
           <w:sz w:val="24"/>
+          <w:lang w:val="pt-BR"/>
         </w:rPr>
-        <w:t>O terceiro capítulo apresenta os trabalhos relacionados. A análise considera estudos sobre recomendação fuzzy, ontologias aplicadas a perfis de usuário, sistemas de recomendação semânticos, estratégias para cold start e soluções voltadas a e-commerce. A comparação busca identificar lacunas técnicas e metodológicas que justifiquem o modelo proposto.</w:t>
+        <w:t>Esta monografia está organizada em sete capítulos. O primeiro apresenta a contextualização do problema, a justificativa, os objetivos, a síntese metodológica e a estrutura geral do trabalho.</w:t>
       </w:r>
     </w:p>
     <w:p>
       <w:pPr>
-        <w:spacing w:line="360" w:lineRule="auto" w:after="120"/>
         <w:ind w:firstLine="709"/>
         <w:jc w:val="both"/>
       </w:pPr>
       <w:r>
         <w:rPr>
-          <w:rFonts w:ascii="Times New Roman" w:hAnsi="Times New Roman"/>
+          <w:rFonts w:ascii="Times New Roman" w:hAnsi="Times New Roman" w:eastAsia="Times New Roman" w:cs="Times New Roman"/>
           <w:b w:val="0"/>
+          <w:i w:val="0"/>
+          <w:color w:val="000000"/>
           <w:sz w:val="24"/>
+          <w:lang w:val="pt-BR"/>
         </w:rPr>
-        <w:t>O quarto capítulo descreve a metodologia. Nele são detalhados o levantamento e a preparação dos dados, o uso do Amazon Reviews 2023 - Home and Kitchen, os critérios de recorte do domínio, a construção da ontologia fuzzy, a definição das variáveis linguísticas, as regras de inferência, a arquitetura do protótipo e a estratégia de extração ou simulação de preferências a partir das interações disponíveis no dataset.</w:t>
+        <w:t xml:space="preserve">O segundo capítulo aborda a fundamentação teórica sobre sistemas de recomendação, filtragem colaborativa, recomendação baseada em conteúdo, lógica </w:t>
+      </w:r>
+      <w:r>
+        <w:rPr>
+          <w:rFonts w:ascii="Times New Roman" w:hAnsi="Times New Roman" w:eastAsia="Times New Roman" w:cs="Times New Roman"/>
+          <w:b w:val="0"/>
+          <w:i/>
+          <w:color w:val="000000"/>
+          <w:sz w:val="24"/>
+          <w:lang w:val="pt-BR"/>
+        </w:rPr>
+        <w:t>fuzzy</w:t>
+      </w:r>
+      <w:r>
+        <w:rPr>
+          <w:rFonts w:ascii="Times New Roman" w:hAnsi="Times New Roman" w:eastAsia="Times New Roman" w:cs="Times New Roman"/>
+          <w:b w:val="0"/>
+          <w:i w:val="0"/>
+          <w:color w:val="000000"/>
+          <w:sz w:val="24"/>
+          <w:lang w:val="pt-BR"/>
+        </w:rPr>
+        <w:t>, ontologias, representação semântica e conceitos arquiteturais necessários ao protótipo.</w:t>
       </w:r>
     </w:p>
     <w:p>
       <w:pPr>
-        <w:spacing w:line="360" w:lineRule="auto" w:after="120"/>
         <w:ind w:firstLine="709"/>
         <w:jc w:val="both"/>
       </w:pPr>
       <w:r>
         <w:rPr>
-          <w:rFonts w:ascii="Times New Roman" w:hAnsi="Times New Roman"/>
+          <w:rFonts w:ascii="Times New Roman" w:hAnsi="Times New Roman" w:eastAsia="Times New Roman" w:cs="Times New Roman"/>
           <w:b w:val="0"/>
+          <w:i w:val="0"/>
+          <w:color w:val="000000"/>
           <w:sz w:val="24"/>
+          <w:lang w:val="pt-BR"/>
         </w:rPr>
-        <w:t>O quinto capítulo trata do desenvolvimento do protótipo. São descritos o motor de recomendação, a integração entre ontologia e regras fuzzy, os componentes de processamento, os mecanismos usados para gerar rankings Top-N e as explicações associadas às recomendações. O foco desse capítulo é mostrar como a proposta conceitual foi transformada em artefato computacional avaliável.</w:t>
+        <w:t xml:space="preserve">O terceiro capítulo apresenta os trabalhos relacionados e compara estudos sobre recomendação </w:t>
+      </w:r>
+      <w:r>
+        <w:rPr>
+          <w:rFonts w:ascii="Times New Roman" w:hAnsi="Times New Roman" w:eastAsia="Times New Roman" w:cs="Times New Roman"/>
+          <w:b w:val="0"/>
+          <w:i/>
+          <w:color w:val="000000"/>
+          <w:sz w:val="24"/>
+          <w:lang w:val="pt-BR"/>
+        </w:rPr>
+        <w:t>fuzzy</w:t>
+      </w:r>
+      <w:r>
+        <w:rPr>
+          <w:rFonts w:ascii="Times New Roman" w:hAnsi="Times New Roman" w:eastAsia="Times New Roman" w:cs="Times New Roman"/>
+          <w:b w:val="0"/>
+          <w:i w:val="0"/>
+          <w:color w:val="000000"/>
+          <w:sz w:val="24"/>
+          <w:lang w:val="pt-BR"/>
+        </w:rPr>
+        <w:t xml:space="preserve">, ontologias, sistemas semânticos, </w:t>
+      </w:r>
+      <w:r>
+        <w:rPr>
+          <w:rFonts w:ascii="Times New Roman" w:hAnsi="Times New Roman" w:eastAsia="Times New Roman" w:cs="Times New Roman"/>
+          <w:b w:val="0"/>
+          <w:i/>
+          <w:color w:val="000000"/>
+          <w:sz w:val="24"/>
+          <w:lang w:val="pt-BR"/>
+        </w:rPr>
+        <w:t>cold start</w:t>
+      </w:r>
+      <w:r>
+        <w:rPr>
+          <w:rFonts w:ascii="Times New Roman" w:hAnsi="Times New Roman" w:eastAsia="Times New Roman" w:cs="Times New Roman"/>
+          <w:b w:val="0"/>
+          <w:i w:val="0"/>
+          <w:color w:val="000000"/>
+          <w:sz w:val="24"/>
+          <w:lang w:val="pt-BR"/>
+        </w:rPr>
+        <w:t>, explicabilidade e aplicações em comércio eletrônico.</w:t>
       </w:r>
     </w:p>
     <w:p>
       <w:pPr>
-        <w:spacing w:line="360" w:lineRule="auto" w:after="120"/>
         <w:ind w:firstLine="709"/>
         <w:jc w:val="both"/>
       </w:pPr>
       <w:r>
         <w:rPr>
-          <w:rFonts w:ascii="Times New Roman" w:hAnsi="Times New Roman"/>
+          <w:rFonts w:ascii="Times New Roman" w:hAnsi="Times New Roman" w:eastAsia="Times New Roman" w:cs="Times New Roman"/>
           <w:b w:val="0"/>
+          <w:i w:val="0"/>
+          <w:color w:val="000000"/>
           <w:sz w:val="24"/>
+          <w:lang w:val="pt-BR"/>
         </w:rPr>
-        <w:t>O sexto capítulo apresenta os testes e a validação experimental. Serão descritas as métricas utilizadas, os baselines de comparação, os cenários de cold start, os resultados obtidos e a análise crítica do desempenho do sistema. A avaliação deve verificar não apenas a precisão das recomendações, mas também cobertura, interpretabilidade e comportamento sob baixa disponibilidade de dados.</w:t>
+        <w:t xml:space="preserve">O quarto capítulo descreve a metodologia, incluindo a preparação do Amazon Reviews 2023 - </w:t>
+      </w:r>
+      <w:r>
+        <w:rPr>
+          <w:rFonts w:ascii="Times New Roman" w:hAnsi="Times New Roman" w:eastAsia="Times New Roman" w:cs="Times New Roman"/>
+          <w:b w:val="0"/>
+          <w:i/>
+          <w:color w:val="000000"/>
+          <w:sz w:val="24"/>
+          <w:lang w:val="pt-BR"/>
+        </w:rPr>
+        <w:t>Home and Kitchen</w:t>
+      </w:r>
+      <w:r>
+        <w:rPr>
+          <w:rFonts w:ascii="Times New Roman" w:hAnsi="Times New Roman" w:eastAsia="Times New Roman" w:cs="Times New Roman"/>
+          <w:b w:val="0"/>
+          <w:i w:val="0"/>
+          <w:color w:val="000000"/>
+          <w:sz w:val="24"/>
+          <w:lang w:val="pt-BR"/>
+        </w:rPr>
+        <w:t xml:space="preserve">, os critérios de recorte, a definição operacional de produto </w:t>
+      </w:r>
+      <w:r>
+        <w:rPr>
+          <w:rFonts w:ascii="Times New Roman" w:hAnsi="Times New Roman" w:eastAsia="Times New Roman" w:cs="Times New Roman"/>
+          <w:b w:val="0"/>
+          <w:i/>
+          <w:color w:val="000000"/>
+          <w:sz w:val="24"/>
+          <w:lang w:val="pt-BR"/>
+        </w:rPr>
+        <w:t>premium</w:t>
+      </w:r>
+      <w:r>
+        <w:rPr>
+          <w:rFonts w:ascii="Times New Roman" w:hAnsi="Times New Roman" w:eastAsia="Times New Roman" w:cs="Times New Roman"/>
+          <w:b w:val="0"/>
+          <w:i w:val="0"/>
+          <w:color w:val="000000"/>
+          <w:sz w:val="24"/>
+          <w:lang w:val="pt-BR"/>
+        </w:rPr>
+        <w:t xml:space="preserve">, a modelagem ontológica e </w:t>
+      </w:r>
+      <w:r>
+        <w:rPr>
+          <w:rFonts w:ascii="Times New Roman" w:hAnsi="Times New Roman" w:eastAsia="Times New Roman" w:cs="Times New Roman"/>
+          <w:b w:val="0"/>
+          <w:i/>
+          <w:color w:val="000000"/>
+          <w:sz w:val="24"/>
+          <w:lang w:val="pt-BR"/>
+        </w:rPr>
+        <w:t>fuzzy</w:t>
+      </w:r>
+      <w:r>
+        <w:rPr>
+          <w:rFonts w:ascii="Times New Roman" w:hAnsi="Times New Roman" w:eastAsia="Times New Roman" w:cs="Times New Roman"/>
+          <w:b w:val="0"/>
+          <w:i w:val="0"/>
+          <w:color w:val="000000"/>
+          <w:sz w:val="24"/>
+          <w:lang w:val="pt-BR"/>
+        </w:rPr>
+        <w:t xml:space="preserve"> e o protocolo experimental.</w:t>
       </w:r>
     </w:p>
     <w:p>
       <w:pPr>
-        <w:spacing w:line="360" w:lineRule="auto" w:after="120"/>
         <w:ind w:firstLine="709"/>
         <w:jc w:val="both"/>
       </w:pPr>
       <w:r>
         <w:rPr>
-          <w:rFonts w:ascii="Times New Roman" w:hAnsi="Times New Roman"/>
+          <w:rFonts w:ascii="Times New Roman" w:hAnsi="Times New Roman" w:eastAsia="Times New Roman" w:cs="Times New Roman"/>
           <w:b w:val="0"/>
+          <w:i w:val="0"/>
+          <w:color w:val="000000"/>
           <w:sz w:val="24"/>
+          <w:lang w:val="pt-BR"/>
         </w:rPr>
-        <w:t>O sétimo capítulo reúne as conclusões e os trabalhos futuros. Essa parte retoma os objetivos, discute os resultados alcançados, aponta limitações do dataset e da modelagem adotada, e indica possíveis extensões, como uso de RDF/OWL, enriquecimento semântico por embeddings, integração com dados reais de navegação e refinamento das funções de pertinência fuzzy.</w:t>
+        <w:t xml:space="preserve">O quinto capítulo trata do desenvolvimento do protótipo e descreve a integração entre ontologia, regras </w:t>
+      </w:r>
+      <w:r>
+        <w:rPr>
+          <w:rFonts w:ascii="Times New Roman" w:hAnsi="Times New Roman" w:eastAsia="Times New Roman" w:cs="Times New Roman"/>
+          <w:b w:val="0"/>
+          <w:i/>
+          <w:color w:val="000000"/>
+          <w:sz w:val="24"/>
+          <w:lang w:val="pt-BR"/>
+        </w:rPr>
+        <w:t>fuzzy</w:t>
+      </w:r>
+      <w:r>
+        <w:rPr>
+          <w:rFonts w:ascii="Times New Roman" w:hAnsi="Times New Roman" w:eastAsia="Times New Roman" w:cs="Times New Roman"/>
+          <w:b w:val="0"/>
+          <w:i w:val="0"/>
+          <w:color w:val="000000"/>
+          <w:sz w:val="24"/>
+          <w:lang w:val="pt-BR"/>
+        </w:rPr>
+        <w:t>, geração de listas Top-N e justificativas das recomendações.</w:t>
+      </w:r>
+    </w:p>
+    <w:p>
+      <w:pPr>
+        <w:ind w:firstLine="709"/>
+        <w:jc w:val="both"/>
+      </w:pPr>
+      <w:r>
+        <w:rPr>
+          <w:rFonts w:ascii="Times New Roman" w:hAnsi="Times New Roman" w:eastAsia="Times New Roman" w:cs="Times New Roman"/>
+          <w:b w:val="0"/>
+          <w:i w:val="0"/>
+          <w:color w:val="000000"/>
+          <w:sz w:val="24"/>
+          <w:lang w:val="pt-BR"/>
+        </w:rPr>
+        <w:t xml:space="preserve">O sexto capítulo apresenta os testes, as métricas, os métodos de referência, os cenários de </w:t>
+      </w:r>
+      <w:r>
+        <w:rPr>
+          <w:rFonts w:ascii="Times New Roman" w:hAnsi="Times New Roman" w:eastAsia="Times New Roman" w:cs="Times New Roman"/>
+          <w:b w:val="0"/>
+          <w:i/>
+          <w:color w:val="000000"/>
+          <w:sz w:val="24"/>
+          <w:lang w:val="pt-BR"/>
+        </w:rPr>
+        <w:t>cold start</w:t>
+      </w:r>
+      <w:r>
+        <w:rPr>
+          <w:rFonts w:ascii="Times New Roman" w:hAnsi="Times New Roman" w:eastAsia="Times New Roman" w:cs="Times New Roman"/>
+          <w:b w:val="0"/>
+          <w:i w:val="0"/>
+          <w:color w:val="000000"/>
+          <w:sz w:val="24"/>
+          <w:lang w:val="pt-BR"/>
+        </w:rPr>
+        <w:t xml:space="preserve"> e a análise dos resultados que forem obtidos.</w:t>
+      </w:r>
+    </w:p>
+    <w:p>
+      <w:pPr>
+        <w:ind w:firstLine="709"/>
+        <w:jc w:val="both"/>
+      </w:pPr>
+      <w:r>
+        <w:rPr>
+          <w:rFonts w:ascii="Times New Roman" w:hAnsi="Times New Roman" w:eastAsia="Times New Roman" w:cs="Times New Roman"/>
+          <w:b w:val="0"/>
+          <w:i w:val="0"/>
+          <w:color w:val="000000"/>
+          <w:sz w:val="24"/>
+          <w:lang w:val="pt-BR"/>
+        </w:rPr>
+        <w:t>O sétimo capítulo reúne as conclusões, as limitações do estudo e as possibilidades de continuidade da pesquisa.</w:t>
       </w:r>
     </w:p>
     <w:sectPr>
-      <w:pgSz w:w="12240" w:h="15840"/>
-      <w:pgMar w:top="1701" w:right="1134" w:bottom="1134" w:left="1701" w:header="720" w:footer="720" w:gutter="0"/>
+      <w:pgSz w:w="11906" w:h="16838"/>
+      <w:pgMar w:top="1701" w:right="1134" w:bottom="1134" w:left="1701" w:header="1134" w:footer="709" w:gutter="0"/>
       <w:cols w:space="720"/>
       <w:docGrid w:linePitch="360"/>
     </w:sectPr>
@@ -731,6 +1642,25 @@
   </w:num>
   <w:num w:numId="9">
     <w:abstractNumId w:val="0"/>
+  </w:num>
+  <w:abstractNum w:abstractNumId="9">
+    <w:multiLevelType w:val="singleLevel"/>
+    <w:lvl w:ilvl="0">
+      <w:start w:val="1"/>
+      <w:numFmt w:val="lowerLetter"/>
+      <w:lvlText w:val="%1)"/>
+      <w:suff w:val="tab"/>
+      <w:lvlJc w:val="left"/>
+      <w:pPr>
+        <w:tabs>
+          <w:tab w:val="num" w:pos="720"/>
+        </w:tabs>
+        <w:ind w:left="720" w:hanging="360"/>
+      </w:pPr>
+    </w:lvl>
+  </w:abstractNum>
+  <w:num w:numId="10">
+    <w:abstractNumId w:val="9"/>
   </w:num>
 </w:numbering>
 </file>
@@ -895,8 +1825,14 @@
     <w:name w:val="Normal"/>
     <w:qFormat/>
     <w:rsid w:val="00FC693F"/>
+    <w:pPr>
+      <w:widowControl/>
+      <w:spacing w:line="360" w:lineRule="auto" w:before="0" w:after="0"/>
+    </w:pPr>
     <w:rPr>
-      <w:rFonts w:ascii="Times New Roman" w:hAnsi="Times New Roman"/>
+      <w:rFonts w:ascii="Times New Roman" w:hAnsi="Times New Roman" w:eastAsia="Times New Roman" w:cs="Times New Roman"/>
+      <w:b w:val="0"/>
+      <w:color w:val="000000"/>
       <w:sz w:val="24"/>
     </w:rPr>
   </w:style>
@@ -955,15 +1891,16 @@
     <w:pPr>
       <w:keepNext/>
       <w:keepLines/>
-      <w:spacing w:before="480" w:after="0"/>
+      <w:pageBreakBefore/>
+      <w:spacing w:before="0" w:after="360" w:line="360" w:lineRule="auto"/>
       <w:outlineLvl w:val="0"/>
     </w:pPr>
     <w:rPr>
-      <w:rFonts w:asciiTheme="majorHAnsi" w:eastAsiaTheme="majorEastAsia" w:hAnsiTheme="majorHAnsi" w:cstheme="majorBidi"/>
+      <w:rFonts w:asciiTheme="majorHAnsi" w:eastAsiaTheme="majorEastAsia" w:hAnsiTheme="majorHAnsi" w:cstheme="majorBidi" w:ascii="Times New Roman" w:hAnsi="Times New Roman" w:eastAsia="Times New Roman" w:cs="Times New Roman"/>
       <w:b/>
       <w:bCs/>
-      <w:color w:val="365F91" w:themeColor="accent1" w:themeShade="BF"/>
-      <w:sz w:val="28"/>
+      <w:color w:val="000000"/>
+      <w:sz w:val="24"/>
       <w:szCs w:val="28"/>
     </w:rPr>
   </w:style>
@@ -979,15 +1916,15 @@
     <w:pPr>
       <w:keepNext/>
       <w:keepLines/>
-      <w:spacing w:before="200" w:after="0"/>
+      <w:spacing w:before="360" w:after="120" w:line="360" w:lineRule="auto"/>
       <w:outlineLvl w:val="1"/>
     </w:pPr>
     <w:rPr>
-      <w:rFonts w:asciiTheme="majorHAnsi" w:eastAsiaTheme="majorEastAsia" w:hAnsiTheme="majorHAnsi" w:cstheme="majorBidi"/>
+      <w:rFonts w:asciiTheme="majorHAnsi" w:eastAsiaTheme="majorEastAsia" w:hAnsiTheme="majorHAnsi" w:cstheme="majorBidi" w:ascii="Times New Roman" w:hAnsi="Times New Roman" w:eastAsia="Times New Roman" w:cs="Times New Roman"/>
       <w:b/>
       <w:bCs/>
-      <w:color w:val="4F81BD" w:themeColor="accent1"/>
-      <w:sz w:val="26"/>
+      <w:color w:val="000000"/>
+      <w:sz w:val="22"/>
       <w:szCs w:val="26"/>
     </w:rPr>
   </w:style>

</xml_diff>